<commit_message>
diagrama de grant+ drive
</commit_message>
<xml_diff>
--- a/docs/Material didáctico/DAM Plantilla memoria escrita.docx
+++ b/docs/Material didáctico/DAM Plantilla memoria escrita.docx
@@ -372,7 +372,7 @@
           <w:r>
             <w:fldChar w:fldCharType="separate"/>
           </w:r>
-          <w:hyperlink w:anchor="_Toc159224213" w:history="1">
+          <w:hyperlink w:anchor="_Toc241172025" w:history="1">
             <w:r>
               <w:rPr>
                 <w:rStyle w:val="Hipervnculo"/>
@@ -417,7 +417,7 @@
                 <w:noProof/>
                 <w:webHidden/>
               </w:rPr>
-              <w:instrText xml:space="preserve"> PAGEREF _Toc159224213 \h </w:instrText>
+              <w:instrText xml:space="preserve"> PAGEREF _Toc241172025 \h </w:instrText>
             </w:r>
             <w:r>
               <w:rPr>
@@ -464,7 +464,7 @@
               <w14:ligatures w14:val="standardContextual"/>
             </w:rPr>
           </w:pPr>
-          <w:hyperlink w:anchor="_Toc159224214" w:history="1">
+          <w:hyperlink w:anchor="_Toc241172026" w:history="1">
             <w:r>
               <w:rPr>
                 <w:rStyle w:val="Hipervnculo"/>
@@ -509,7 +509,7 @@
                 <w:noProof/>
                 <w:webHidden/>
               </w:rPr>
-              <w:instrText xml:space="preserve"> PAGEREF _Toc159224214 \h </w:instrText>
+              <w:instrText xml:space="preserve"> PAGEREF _Toc241172026 \h </w:instrText>
             </w:r>
             <w:r>
               <w:rPr>
@@ -556,7 +556,7 @@
               <w14:ligatures w14:val="standardContextual"/>
             </w:rPr>
           </w:pPr>
-          <w:hyperlink w:anchor="_Toc159224215" w:history="1">
+          <w:hyperlink w:anchor="_Toc241172027" w:history="1">
             <w:r>
               <w:rPr>
                 <w:rStyle w:val="Hipervnculo"/>
@@ -601,7 +601,7 @@
                 <w:noProof/>
                 <w:webHidden/>
               </w:rPr>
-              <w:instrText xml:space="preserve"> PAGEREF _Toc159224215 \h </w:instrText>
+              <w:instrText xml:space="preserve"> PAGEREF _Toc241172027 \h </w:instrText>
             </w:r>
             <w:r>
               <w:rPr>
@@ -648,7 +648,7 @@
               <w14:ligatures w14:val="standardContextual"/>
             </w:rPr>
           </w:pPr>
-          <w:hyperlink w:anchor="_Toc159224216" w:history="1">
+          <w:hyperlink w:anchor="_Toc241172028" w:history="1">
             <w:r>
               <w:rPr>
                 <w:rStyle w:val="Hipervnculo"/>
@@ -693,7 +693,7 @@
                 <w:noProof/>
                 <w:webHidden/>
               </w:rPr>
-              <w:instrText xml:space="preserve"> PAGEREF _Toc159224216 \h </w:instrText>
+              <w:instrText xml:space="preserve"> PAGEREF _Toc241172028 \h </w:instrText>
             </w:r>
             <w:r>
               <w:rPr>
@@ -740,7 +740,7 @@
               <w14:ligatures w14:val="standardContextual"/>
             </w:rPr>
           </w:pPr>
-          <w:hyperlink w:anchor="_Toc159224217" w:history="1">
+          <w:hyperlink w:anchor="_Toc241172029" w:history="1">
             <w:r>
               <w:rPr>
                 <w:rStyle w:val="Hipervnculo"/>
@@ -785,7 +785,7 @@
                 <w:noProof/>
                 <w:webHidden/>
               </w:rPr>
-              <w:instrText xml:space="preserve"> PAGEREF _Toc159224217 \h </w:instrText>
+              <w:instrText xml:space="preserve"> PAGEREF _Toc241172029 \h </w:instrText>
             </w:r>
             <w:r>
               <w:rPr>
@@ -805,7 +805,7 @@
                 <w:noProof/>
                 <w:webHidden/>
               </w:rPr>
-              <w:t>4</w:t>
+              <w:t>5</w:t>
             </w:r>
             <w:r>
               <w:rPr>
@@ -832,7 +832,7 @@
               <w14:ligatures w14:val="standardContextual"/>
             </w:rPr>
           </w:pPr>
-          <w:hyperlink w:anchor="_Toc159224218" w:history="1">
+          <w:hyperlink w:anchor="_Toc241172030" w:history="1">
             <w:r>
               <w:rPr>
                 <w:rStyle w:val="Hipervnculo"/>
@@ -877,7 +877,7 @@
                 <w:noProof/>
                 <w:webHidden/>
               </w:rPr>
-              <w:instrText xml:space="preserve"> PAGEREF _Toc159224218 \h </w:instrText>
+              <w:instrText xml:space="preserve"> PAGEREF _Toc241172030 \h </w:instrText>
             </w:r>
             <w:r>
               <w:rPr>
@@ -897,7 +897,7 @@
                 <w:noProof/>
                 <w:webHidden/>
               </w:rPr>
-              <w:t>5</w:t>
+              <w:t>6</w:t>
             </w:r>
             <w:r>
               <w:rPr>
@@ -924,7 +924,7 @@
               <w14:ligatures w14:val="standardContextual"/>
             </w:rPr>
           </w:pPr>
-          <w:hyperlink w:anchor="_Toc159224219" w:history="1">
+          <w:hyperlink w:anchor="_Toc241172031" w:history="1">
             <w:r>
               <w:rPr>
                 <w:rStyle w:val="Hipervnculo"/>
@@ -948,7 +948,21 @@
                 <w:rStyle w:val="Hipervnculo"/>
                 <w:noProof/>
               </w:rPr>
-              <w:t>Tecnologías y herramientas utilizadas en el proyecto</w:t>
+              <w:t>Tecn</w:t>
+            </w:r>
+            <w:r>
+              <w:rPr>
+                <w:rStyle w:val="Hipervnculo"/>
+                <w:noProof/>
+              </w:rPr>
+              <w:t>o</w:t>
+            </w:r>
+            <w:r>
+              <w:rPr>
+                <w:rStyle w:val="Hipervnculo"/>
+                <w:noProof/>
+              </w:rPr>
+              <w:t>logías y herramientas utilizadas en el proyecto</w:t>
             </w:r>
             <w:r>
               <w:rPr>
@@ -969,7 +983,7 @@
                 <w:noProof/>
                 <w:webHidden/>
               </w:rPr>
-              <w:instrText xml:space="preserve"> PAGEREF _Toc159224219 \h </w:instrText>
+              <w:instrText xml:space="preserve"> PAGEREF _Toc241172031 \h </w:instrText>
             </w:r>
             <w:r>
               <w:rPr>
@@ -989,7 +1003,7 @@
                 <w:noProof/>
                 <w:webHidden/>
               </w:rPr>
-              <w:t>6</w:t>
+              <w:t>7</w:t>
             </w:r>
             <w:r>
               <w:rPr>
@@ -1016,7 +1030,7 @@
               <w14:ligatures w14:val="standardContextual"/>
             </w:rPr>
           </w:pPr>
-          <w:hyperlink w:anchor="_Toc159224220" w:history="1">
+          <w:hyperlink w:anchor="_Toc241172032" w:history="1">
             <w:r>
               <w:rPr>
                 <w:rStyle w:val="Hipervnculo"/>
@@ -1061,7 +1075,7 @@
                 <w:noProof/>
                 <w:webHidden/>
               </w:rPr>
-              <w:instrText xml:space="preserve"> PAGEREF _Toc159224220 \h </w:instrText>
+              <w:instrText xml:space="preserve"> PAGEREF _Toc241172032 \h </w:instrText>
             </w:r>
             <w:r>
               <w:rPr>
@@ -1081,7 +1095,7 @@
                 <w:noProof/>
                 <w:webHidden/>
               </w:rPr>
-              <w:t>7</w:t>
+              <w:t>8</w:t>
             </w:r>
             <w:r>
               <w:rPr>
@@ -1108,7 +1122,7 @@
               <w14:ligatures w14:val="standardContextual"/>
             </w:rPr>
           </w:pPr>
-          <w:hyperlink w:anchor="_Toc159224221" w:history="1">
+          <w:hyperlink w:anchor="_Toc241172033" w:history="1">
             <w:r>
               <w:rPr>
                 <w:rStyle w:val="Hipervnculo"/>
@@ -1153,7 +1167,7 @@
                 <w:noProof/>
                 <w:webHidden/>
               </w:rPr>
-              <w:instrText xml:space="preserve"> PAGEREF _Toc159224221 \h </w:instrText>
+              <w:instrText xml:space="preserve"> PAGEREF _Toc241172033 \h </w:instrText>
             </w:r>
             <w:r>
               <w:rPr>
@@ -1173,7 +1187,7 @@
                 <w:noProof/>
                 <w:webHidden/>
               </w:rPr>
-              <w:t>8</w:t>
+              <w:t>9</w:t>
             </w:r>
             <w:r>
               <w:rPr>
@@ -1200,7 +1214,7 @@
               <w14:ligatures w14:val="standardContextual"/>
             </w:rPr>
           </w:pPr>
-          <w:hyperlink w:anchor="_Toc159224222" w:history="1">
+          <w:hyperlink w:anchor="_Toc241172034" w:history="1">
             <w:r>
               <w:rPr>
                 <w:rStyle w:val="Hipervnculo"/>
@@ -1245,7 +1259,7 @@
                 <w:noProof/>
                 <w:webHidden/>
               </w:rPr>
-              <w:instrText xml:space="preserve"> PAGEREF _Toc159224222 \h </w:instrText>
+              <w:instrText xml:space="preserve"> PAGEREF _Toc241172034 \h </w:instrText>
             </w:r>
             <w:r>
               <w:rPr>
@@ -1265,7 +1279,7 @@
                 <w:noProof/>
                 <w:webHidden/>
               </w:rPr>
-              <w:t>9</w:t>
+              <w:t>10</w:t>
             </w:r>
             <w:r>
               <w:rPr>
@@ -1292,7 +1306,7 @@
               <w14:ligatures w14:val="standardContextual"/>
             </w:rPr>
           </w:pPr>
-          <w:hyperlink w:anchor="_Toc159224223" w:history="1">
+          <w:hyperlink w:anchor="_Toc241172035" w:history="1">
             <w:r>
               <w:rPr>
                 <w:rStyle w:val="Hipervnculo"/>
@@ -1337,7 +1351,7 @@
                 <w:noProof/>
                 <w:webHidden/>
               </w:rPr>
-              <w:instrText xml:space="preserve"> PAGEREF _Toc159224223 \h </w:instrText>
+              <w:instrText xml:space="preserve"> PAGEREF _Toc241172035 \h </w:instrText>
             </w:r>
             <w:r>
               <w:rPr>
@@ -1357,7 +1371,7 @@
                 <w:noProof/>
                 <w:webHidden/>
               </w:rPr>
-              <w:t>10</w:t>
+              <w:t>11</w:t>
             </w:r>
             <w:r>
               <w:rPr>
@@ -1384,7 +1398,7 @@
               <w14:ligatures w14:val="standardContextual"/>
             </w:rPr>
           </w:pPr>
-          <w:hyperlink w:anchor="_Toc159224224" w:history="1">
+          <w:hyperlink w:anchor="_Toc241172036" w:history="1">
             <w:r>
               <w:rPr>
                 <w:rStyle w:val="Hipervnculo"/>
@@ -1429,7 +1443,7 @@
                 <w:noProof/>
                 <w:webHidden/>
               </w:rPr>
-              <w:instrText xml:space="preserve"> PAGEREF _Toc159224224 \h </w:instrText>
+              <w:instrText xml:space="preserve"> PAGEREF _Toc241172036 \h </w:instrText>
             </w:r>
             <w:r>
               <w:rPr>
@@ -1449,7 +1463,7 @@
                 <w:noProof/>
                 <w:webHidden/>
               </w:rPr>
-              <w:t>11</w:t>
+              <w:t>12</w:t>
             </w:r>
             <w:r>
               <w:rPr>
@@ -1476,7 +1490,7 @@
               <w14:ligatures w14:val="standardContextual"/>
             </w:rPr>
           </w:pPr>
-          <w:hyperlink w:anchor="_Toc159224225" w:history="1">
+          <w:hyperlink w:anchor="_Toc241172037" w:history="1">
             <w:r>
               <w:rPr>
                 <w:rStyle w:val="Hipervnculo"/>
@@ -1521,7 +1535,7 @@
                 <w:noProof/>
                 <w:webHidden/>
               </w:rPr>
-              <w:instrText xml:space="preserve"> PAGEREF _Toc159224225 \h </w:instrText>
+              <w:instrText xml:space="preserve"> PAGEREF _Toc241172037 \h </w:instrText>
             </w:r>
             <w:r>
               <w:rPr>
@@ -1541,7 +1555,7 @@
                 <w:noProof/>
                 <w:webHidden/>
               </w:rPr>
-              <w:t>12</w:t>
+              <w:t>13</w:t>
             </w:r>
             <w:r>
               <w:rPr>
@@ -1568,7 +1582,7 @@
               <w14:ligatures w14:val="standardContextual"/>
             </w:rPr>
           </w:pPr>
-          <w:hyperlink w:anchor="_Toc159224226" w:history="1">
+          <w:hyperlink w:anchor="_Toc241172038" w:history="1">
             <w:r>
               <w:rPr>
                 <w:rStyle w:val="Hipervnculo"/>
@@ -1613,7 +1627,7 @@
                 <w:noProof/>
                 <w:webHidden/>
               </w:rPr>
-              <w:instrText xml:space="preserve"> PAGEREF _Toc159224226 \h </w:instrText>
+              <w:instrText xml:space="preserve"> PAGEREF _Toc241172038 \h </w:instrText>
             </w:r>
             <w:r>
               <w:rPr>
@@ -1633,7 +1647,7 @@
                 <w:noProof/>
                 <w:webHidden/>
               </w:rPr>
-              <w:t>13</w:t>
+              <w:t>14</w:t>
             </w:r>
             <w:r>
               <w:rPr>
@@ -1660,7 +1674,7 @@
               <w14:ligatures w14:val="standardContextual"/>
             </w:rPr>
           </w:pPr>
-          <w:hyperlink w:anchor="_Toc159224227" w:history="1">
+          <w:hyperlink w:anchor="_Toc241172039" w:history="1">
             <w:r>
               <w:rPr>
                 <w:rStyle w:val="Hipervnculo"/>
@@ -1705,7 +1719,7 @@
                 <w:noProof/>
                 <w:webHidden/>
               </w:rPr>
-              <w:instrText xml:space="preserve"> PAGEREF _Toc159224227 \h </w:instrText>
+              <w:instrText xml:space="preserve"> PAGEREF _Toc241172039 \h </w:instrText>
             </w:r>
             <w:r>
               <w:rPr>
@@ -1725,7 +1739,7 @@
                 <w:noProof/>
                 <w:webHidden/>
               </w:rPr>
-              <w:t>14</w:t>
+              <w:t>15</w:t>
             </w:r>
             <w:r>
               <w:rPr>
@@ -1752,7 +1766,7 @@
               <w14:ligatures w14:val="standardContextual"/>
             </w:rPr>
           </w:pPr>
-          <w:hyperlink w:anchor="_Toc159224228" w:history="1">
+          <w:hyperlink w:anchor="_Toc241172040" w:history="1">
             <w:r>
               <w:rPr>
                 <w:rStyle w:val="Hipervnculo"/>
@@ -1797,7 +1811,7 @@
                 <w:noProof/>
                 <w:webHidden/>
               </w:rPr>
-              <w:instrText xml:space="preserve"> PAGEREF _Toc159224228 \h </w:instrText>
+              <w:instrText xml:space="preserve"> PAGEREF _Toc241172040 \h </w:instrText>
             </w:r>
             <w:r>
               <w:rPr>
@@ -1817,7 +1831,7 @@
                 <w:noProof/>
                 <w:webHidden/>
               </w:rPr>
-              <w:t>14</w:t>
+              <w:t>15</w:t>
             </w:r>
             <w:r>
               <w:rPr>
@@ -1844,7 +1858,7 @@
               <w14:ligatures w14:val="standardContextual"/>
             </w:rPr>
           </w:pPr>
-          <w:hyperlink w:anchor="_Toc159224229" w:history="1">
+          <w:hyperlink w:anchor="_Toc241172041" w:history="1">
             <w:r>
               <w:rPr>
                 <w:rStyle w:val="Hipervnculo"/>
@@ -1889,7 +1903,7 @@
                 <w:noProof/>
                 <w:webHidden/>
               </w:rPr>
-              <w:instrText xml:space="preserve"> PAGEREF _Toc159224229 \h </w:instrText>
+              <w:instrText xml:space="preserve"> PAGEREF _Toc241172041 \h </w:instrText>
             </w:r>
             <w:r>
               <w:rPr>
@@ -1909,7 +1923,7 @@
                 <w:noProof/>
                 <w:webHidden/>
               </w:rPr>
-              <w:t>14</w:t>
+              <w:t>15</w:t>
             </w:r>
             <w:r>
               <w:rPr>
@@ -1956,7 +1970,7 @@
           <w:numId w:val="1"/>
         </w:numPr>
       </w:pPr>
-      <w:bookmarkStart w:id="2" w:name="_Toc159224213"/>
+      <w:bookmarkStart w:id="2" w:name="_Toc241172025"/>
       <w:r>
         <w:lastRenderedPageBreak/>
         <w:t>Introducción</w:t>
@@ -1967,8 +1981,15 @@
       </w:r>
     </w:p>
     <w:p>
-      <w:r>
-        <w:t>(3-4 Páginas)</w:t>
+      <w:pPr>
+        <w:pStyle w:val="Prrafodelista"/>
+        <w:numPr>
+          <w:ilvl w:val="1"/>
+          <w:numId w:val="3"/>
+        </w:numPr>
+      </w:pPr>
+      <w:r>
+        <w:t>Páginas)</w:t>
       </w:r>
     </w:p>
     <w:p>
@@ -1979,12 +2000,37 @@
           <w:numId w:val="1"/>
         </w:numPr>
       </w:pPr>
-      <w:bookmarkStart w:id="3" w:name="_Toc159224214"/>
-      <w:r>
-        <w:lastRenderedPageBreak/>
+      <w:bookmarkStart w:id="3" w:name="_Toc241172026"/>
+      <w:r>
         <w:t>Motivación</w:t>
       </w:r>
       <w:bookmarkEnd w:id="3"/>
+    </w:p>
+    <w:p>
+      <w:r>
+        <w:t xml:space="preserve">El tema escogido es la gestión de una clínica, que con unas variaciones se pudiera implementar en cualquier sector, la idea es crear una web donde el cliente pueda ver las especialidades y darse de alta pudiendo ver su historial y pedir citas. Una app de escritorio para los médicos y administrativos viendo información laboral y medico creando pulseras para los clientes con un </w:t>
+      </w:r>
+      <w:proofErr w:type="spellStart"/>
+      <w:r>
+        <w:t>qr</w:t>
+      </w:r>
+      <w:proofErr w:type="spellEnd"/>
+      <w:r>
+        <w:t xml:space="preserve"> y nombre, una app Android para enfermeras y demás donde puedan escanear las pulseras y visualizar la información del cliente y sus pruebas.</w:t>
+      </w:r>
+    </w:p>
+    <w:p>
+      <w:r>
+        <w:t xml:space="preserve">La empresa seleccionada, la clínica, es porque abarca múltiples posibilidades y da la posibilidad de ejercer todo lo aprendido, base de datos, gestión de clientes, gestión de ficheros, datos sensibles, incluso sostenibilidad ya que podemos partir de actualizar una empresa que aun usa papel, puede que ya no queden </w:t>
+      </w:r>
+      <w:proofErr w:type="gramStart"/>
+      <w:r>
+        <w:t>muchas</w:t>
+      </w:r>
+      <w:proofErr w:type="gramEnd"/>
+      <w:r>
+        <w:t xml:space="preserve"> pero es para poder hacer un ejemplo y poder aplicar todas las áreas dadas.</w:t>
+      </w:r>
     </w:p>
     <w:p>
       <w:pPr>
@@ -1994,7 +2040,7 @@
           <w:numId w:val="1"/>
         </w:numPr>
       </w:pPr>
-      <w:bookmarkStart w:id="4" w:name="_Toc159224215"/>
+      <w:bookmarkStart w:id="4" w:name="_Toc241172027"/>
       <w:proofErr w:type="spellStart"/>
       <w:r>
         <w:t>Abstract</w:t>
@@ -2002,6 +2048,7 @@
       <w:bookmarkEnd w:id="4"/>
       <w:proofErr w:type="spellEnd"/>
     </w:p>
+    <w:p/>
     <w:p>
       <w:pPr>
         <w:pStyle w:val="Ttulo2"/>
@@ -2010,11 +2057,437 @@
           <w:numId w:val="1"/>
         </w:numPr>
       </w:pPr>
-      <w:bookmarkStart w:id="5" w:name="_Toc159224216"/>
+      <w:bookmarkStart w:id="5" w:name="_Toc241172028"/>
       <w:r>
         <w:t>Objetivos propuestos (generales y específicos)</w:t>
       </w:r>
       <w:bookmarkEnd w:id="5"/>
+    </w:p>
+    <w:p>
+      <w:pPr>
+        <w:rPr>
+          <w:b/>
+          <w:bCs/>
+        </w:rPr>
+      </w:pPr>
+      <w:r>
+        <w:rPr>
+          <w:b/>
+          <w:bCs/>
+        </w:rPr>
+        <w:t xml:space="preserve">Una base de </w:t>
+      </w:r>
+      <w:proofErr w:type="gramStart"/>
+      <w:r>
+        <w:rPr>
+          <w:b/>
+          <w:bCs/>
+        </w:rPr>
+        <w:t xml:space="preserve">datos, </w:t>
+      </w:r>
+      <w:r>
+        <w:t xml:space="preserve"> donde</w:t>
+      </w:r>
+      <w:proofErr w:type="gramEnd"/>
+      <w:r>
+        <w:t xml:space="preserve"> se almacene los datos del </w:t>
+      </w:r>
+      <w:r>
+        <w:t>paciente</w:t>
+      </w:r>
+      <w:r>
+        <w:t xml:space="preserve">, los datos del personal, incluyendo citas, informes, horarios, todo lo necesario para el funcionamiento de la empresa y para el </w:t>
+      </w:r>
+      <w:r>
+        <w:t>paciente</w:t>
+      </w:r>
+      <w:r>
+        <w:t>, diferenciando los datos sensibles, diferenciando los niveles de permisos.</w:t>
+      </w:r>
+      <w:r>
+        <w:br/>
+        <w:t>Sus Objetivos Específicos:</w:t>
+      </w:r>
+    </w:p>
+    <w:p>
+      <w:pPr>
+        <w:pStyle w:val="Prrafodelista"/>
+        <w:numPr>
+          <w:ilvl w:val="0"/>
+          <w:numId w:val="5"/>
+        </w:numPr>
+        <w:rPr>
+          <w:b/>
+          <w:bCs/>
+        </w:rPr>
+      </w:pPr>
+      <w:r>
+        <w:t>Creación de entidades, sus atributos y sus relaciones, haciendo un diagrama E-R</w:t>
+      </w:r>
+    </w:p>
+    <w:p>
+      <w:pPr>
+        <w:pStyle w:val="Prrafodelista"/>
+        <w:numPr>
+          <w:ilvl w:val="0"/>
+          <w:numId w:val="5"/>
+        </w:numPr>
+        <w:rPr>
+          <w:b/>
+          <w:bCs/>
+        </w:rPr>
+      </w:pPr>
+      <w:r>
+        <w:t>Creación de las tablas, con sus campos, sus KEY primarias o secundarias.</w:t>
+      </w:r>
+    </w:p>
+    <w:p>
+      <w:pPr>
+        <w:pStyle w:val="Prrafodelista"/>
+        <w:numPr>
+          <w:ilvl w:val="0"/>
+          <w:numId w:val="5"/>
+        </w:numPr>
+        <w:rPr>
+          <w:b/>
+          <w:bCs/>
+        </w:rPr>
+      </w:pPr>
+      <w:r>
+        <w:t>Creación de usuarios y permisos</w:t>
+      </w:r>
+    </w:p>
+    <w:p>
+      <w:pPr>
+        <w:pStyle w:val="Prrafodelista"/>
+        <w:numPr>
+          <w:ilvl w:val="0"/>
+          <w:numId w:val="5"/>
+        </w:numPr>
+        <w:rPr>
+          <w:b/>
+          <w:bCs/>
+        </w:rPr>
+      </w:pPr>
+      <w:r>
+        <w:t xml:space="preserve">Creación de funciones y </w:t>
+      </w:r>
+      <w:proofErr w:type="spellStart"/>
+      <w:r>
+        <w:t>triggers</w:t>
+      </w:r>
+      <w:proofErr w:type="spellEnd"/>
+      <w:r>
+        <w:t xml:space="preserve"> según necesidad</w:t>
+      </w:r>
+    </w:p>
+    <w:p>
+      <w:pPr>
+        <w:suppressAutoHyphens/>
+        <w:autoSpaceDN w:val="0"/>
+        <w:spacing w:before="0" w:after="160" w:line="278" w:lineRule="auto"/>
+        <w:jc w:val="left"/>
+        <w:textAlignment w:val="baseline"/>
+        <w:rPr>
+          <w:szCs w:val="22"/>
+        </w:rPr>
+      </w:pPr>
+      <w:r>
+        <w:rPr>
+          <w:b/>
+          <w:bCs/>
+          <w:szCs w:val="22"/>
+        </w:rPr>
+        <w:br/>
+      </w:r>
+      <w:r>
+        <w:rPr>
+          <w:b/>
+          <w:bCs/>
+          <w:szCs w:val="22"/>
+        </w:rPr>
+        <w:br/>
+      </w:r>
+      <w:r>
+        <w:rPr>
+          <w:b/>
+          <w:bCs/>
+          <w:szCs w:val="22"/>
+        </w:rPr>
+        <w:br/>
+      </w:r>
+      <w:r>
+        <w:rPr>
+          <w:b/>
+          <w:bCs/>
+          <w:szCs w:val="22"/>
+        </w:rPr>
+        <w:br/>
+      </w:r>
+      <w:r>
+        <w:rPr>
+          <w:b/>
+          <w:bCs/>
+          <w:szCs w:val="22"/>
+        </w:rPr>
+        <w:br/>
+      </w:r>
+      <w:r>
+        <w:rPr>
+          <w:b/>
+          <w:bCs/>
+          <w:szCs w:val="22"/>
+        </w:rPr>
+        <w:br/>
+      </w:r>
+      <w:r>
+        <w:rPr>
+          <w:b/>
+          <w:bCs/>
+          <w:szCs w:val="22"/>
+        </w:rPr>
+        <w:br/>
+      </w:r>
+      <w:r>
+        <w:rPr>
+          <w:b/>
+          <w:bCs/>
+          <w:szCs w:val="22"/>
+        </w:rPr>
+        <w:br/>
+      </w:r>
+      <w:r>
+        <w:rPr>
+          <w:b/>
+          <w:bCs/>
+          <w:szCs w:val="22"/>
+        </w:rPr>
+        <w:lastRenderedPageBreak/>
+        <w:t xml:space="preserve">Una Aplicación de </w:t>
+      </w:r>
+      <w:proofErr w:type="gramStart"/>
+      <w:r>
+        <w:rPr>
+          <w:b/>
+          <w:bCs/>
+          <w:szCs w:val="22"/>
+        </w:rPr>
+        <w:t xml:space="preserve">escritorio, </w:t>
+      </w:r>
+      <w:r>
+        <w:rPr>
+          <w:szCs w:val="22"/>
+        </w:rPr>
+        <w:t xml:space="preserve"> donde</w:t>
+      </w:r>
+      <w:proofErr w:type="gramEnd"/>
+      <w:r>
+        <w:rPr>
+          <w:szCs w:val="22"/>
+        </w:rPr>
+        <w:t xml:space="preserve"> los trabajadores podrán acceder desde sus ordenadores, consultar pacientes, consultar citas, consultar sus horarios, agendar citas o modificaciones.</w:t>
+      </w:r>
+      <w:r>
+        <w:rPr>
+          <w:szCs w:val="22"/>
+        </w:rPr>
+        <w:br/>
+        <w:t>Sus objetivos Específicos:</w:t>
+      </w:r>
+    </w:p>
+    <w:p>
+      <w:pPr>
+        <w:numPr>
+          <w:ilvl w:val="1"/>
+          <w:numId w:val="5"/>
+        </w:numPr>
+        <w:suppressAutoHyphens/>
+        <w:autoSpaceDN w:val="0"/>
+        <w:spacing w:before="0" w:after="160" w:line="278" w:lineRule="auto"/>
+        <w:jc w:val="left"/>
+        <w:textAlignment w:val="baseline"/>
+        <w:rPr>
+          <w:szCs w:val="22"/>
+        </w:rPr>
+      </w:pPr>
+      <w:r>
+        <w:rPr>
+          <w:szCs w:val="22"/>
+        </w:rPr>
+        <w:t>El uso de JAVAFX, para la creación de la app.</w:t>
+      </w:r>
+    </w:p>
+    <w:p>
+      <w:pPr>
+        <w:numPr>
+          <w:ilvl w:val="1"/>
+          <w:numId w:val="5"/>
+        </w:numPr>
+        <w:suppressAutoHyphens/>
+        <w:autoSpaceDN w:val="0"/>
+        <w:spacing w:before="0" w:after="160" w:line="278" w:lineRule="auto"/>
+        <w:jc w:val="left"/>
+        <w:textAlignment w:val="baseline"/>
+        <w:rPr>
+          <w:szCs w:val="22"/>
+        </w:rPr>
+      </w:pPr>
+      <w:r>
+        <w:rPr>
+          <w:szCs w:val="22"/>
+        </w:rPr>
+        <w:t>Gestión (CRUD)</w:t>
+      </w:r>
+    </w:p>
+    <w:p>
+      <w:pPr>
+        <w:rPr>
+          <w:szCs w:val="22"/>
+        </w:rPr>
+      </w:pPr>
+      <w:r>
+        <w:rPr>
+          <w:szCs w:val="22"/>
+        </w:rPr>
+        <w:t xml:space="preserve">Generación de </w:t>
+      </w:r>
+      <w:proofErr w:type="spellStart"/>
+      <w:r>
+        <w:rPr>
+          <w:szCs w:val="22"/>
+        </w:rPr>
+        <w:t>qr</w:t>
+      </w:r>
+      <w:proofErr w:type="spellEnd"/>
+      <w:r>
+        <w:rPr>
+          <w:szCs w:val="22"/>
+        </w:rPr>
+        <w:t xml:space="preserve"> para impresión de pulsera en recepción de </w:t>
+      </w:r>
+      <w:r>
+        <w:rPr>
+          <w:szCs w:val="22"/>
+        </w:rPr>
+        <w:t>pacientes</w:t>
+      </w:r>
+    </w:p>
+    <w:p>
+      <w:pPr>
+        <w:suppressAutoHyphens/>
+        <w:autoSpaceDN w:val="0"/>
+        <w:spacing w:before="0" w:after="160" w:line="278" w:lineRule="auto"/>
+        <w:jc w:val="left"/>
+        <w:textAlignment w:val="baseline"/>
+        <w:rPr>
+          <w:szCs w:val="22"/>
+        </w:rPr>
+      </w:pPr>
+      <w:r>
+        <w:rPr>
+          <w:b/>
+          <w:bCs/>
+          <w:szCs w:val="22"/>
+        </w:rPr>
+        <w:t xml:space="preserve">Una aplicación Android, </w:t>
+      </w:r>
+      <w:r>
+        <w:rPr>
+          <w:szCs w:val="22"/>
+        </w:rPr>
+        <w:t xml:space="preserve">donde los trabajadores podrán acceder a ficha del </w:t>
+      </w:r>
+      <w:r>
+        <w:rPr>
+          <w:szCs w:val="22"/>
+        </w:rPr>
+        <w:t>paciente</w:t>
+      </w:r>
+      <w:r>
+        <w:rPr>
+          <w:szCs w:val="22"/>
+        </w:rPr>
+        <w:t xml:space="preserve"> para no tener que estar en el ordenador, uso de </w:t>
+      </w:r>
+      <w:proofErr w:type="spellStart"/>
+      <w:r>
+        <w:rPr>
+          <w:szCs w:val="22"/>
+        </w:rPr>
+        <w:t>qr</w:t>
+      </w:r>
+      <w:proofErr w:type="spellEnd"/>
+      <w:r>
+        <w:rPr>
+          <w:szCs w:val="22"/>
+        </w:rPr>
+        <w:t xml:space="preserve"> para visualización de ficha del</w:t>
+      </w:r>
+      <w:r>
+        <w:rPr>
+          <w:szCs w:val="22"/>
+        </w:rPr>
+        <w:t xml:space="preserve"> paciente</w:t>
+      </w:r>
+      <w:r>
+        <w:rPr>
+          <w:szCs w:val="22"/>
+        </w:rPr>
+        <w:t xml:space="preserve"> y prueba que se ha de realizar en el día. </w:t>
+      </w:r>
+      <w:r>
+        <w:rPr>
+          <w:szCs w:val="22"/>
+        </w:rPr>
+        <w:br/>
+        <w:t>Sus objetivos Específicos:</w:t>
+      </w:r>
+    </w:p>
+    <w:p>
+      <w:pPr>
+        <w:numPr>
+          <w:ilvl w:val="1"/>
+          <w:numId w:val="4"/>
+        </w:numPr>
+        <w:suppressAutoHyphens/>
+        <w:autoSpaceDN w:val="0"/>
+        <w:spacing w:before="0" w:after="160" w:line="278" w:lineRule="auto"/>
+        <w:jc w:val="left"/>
+        <w:textAlignment w:val="baseline"/>
+        <w:rPr>
+          <w:b/>
+          <w:bCs/>
+        </w:rPr>
+      </w:pPr>
+      <w:r>
+        <w:rPr>
+          <w:szCs w:val="22"/>
+        </w:rPr>
+        <w:t>Autenticación por roles</w:t>
+      </w:r>
+    </w:p>
+    <w:p>
+      <w:pPr>
+        <w:numPr>
+          <w:ilvl w:val="1"/>
+          <w:numId w:val="4"/>
+        </w:numPr>
+        <w:suppressAutoHyphens/>
+        <w:autoSpaceDN w:val="0"/>
+        <w:spacing w:before="0" w:after="160" w:line="278" w:lineRule="auto"/>
+        <w:jc w:val="left"/>
+        <w:textAlignment w:val="baseline"/>
+        <w:rPr>
+          <w:b/>
+          <w:bCs/>
+        </w:rPr>
+      </w:pPr>
+      <w:r>
+        <w:rPr>
+          <w:szCs w:val="22"/>
+        </w:rPr>
+        <w:t>Módulo de Lectura QR</w:t>
+      </w:r>
       <w:r>
         <w:br w:type="page"/>
       </w:r>
@@ -2027,7 +2500,7 @@
           <w:numId w:val="1"/>
         </w:numPr>
       </w:pPr>
-      <w:bookmarkStart w:id="6" w:name="_Toc159224217"/>
+      <w:bookmarkStart w:id="6" w:name="_Toc241172029"/>
       <w:r>
         <w:lastRenderedPageBreak/>
         <w:t>Estado del Arte</w:t>
@@ -2053,7 +2526,7 @@
           <w:numId w:val="1"/>
         </w:numPr>
       </w:pPr>
-      <w:bookmarkStart w:id="7" w:name="_Toc159224218"/>
+      <w:bookmarkStart w:id="7" w:name="_Toc241172030"/>
       <w:r>
         <w:lastRenderedPageBreak/>
         <w:t>Metodología usada</w:t>
@@ -2081,7 +2554,7 @@
           <w:numId w:val="1"/>
         </w:numPr>
       </w:pPr>
-      <w:bookmarkStart w:id="8" w:name="_Toc159224219"/>
+      <w:bookmarkStart w:id="8" w:name="_Toc241172031"/>
       <w:r>
         <w:lastRenderedPageBreak/>
         <w:t>Tecnologías y herramientas utilizadas en el proyecto</w:t>
@@ -2094,6 +2567,255 @@
       </w:r>
     </w:p>
     <w:p>
+      <w:pPr>
+        <w:pStyle w:val="Ttulo2"/>
+        <w:rPr>
+          <w:sz w:val="22"/>
+          <w:szCs w:val="22"/>
+        </w:rPr>
+      </w:pPr>
+      <w:bookmarkStart w:id="9" w:name="_Toc241170496"/>
+      <w:r>
+        <w:rPr>
+          <w:sz w:val="22"/>
+          <w:szCs w:val="22"/>
+        </w:rPr>
+        <w:t>Para la aplicación de escritorio:</w:t>
+      </w:r>
+      <w:bookmarkEnd w:id="9"/>
+    </w:p>
+    <w:p>
+      <w:pPr>
+        <w:pStyle w:val="Prrafodelista"/>
+        <w:numPr>
+          <w:ilvl w:val="0"/>
+          <w:numId w:val="7"/>
+        </w:numPr>
+      </w:pPr>
+      <w:proofErr w:type="spellStart"/>
+      <w:r>
+        <w:t>JavaFx</w:t>
+      </w:r>
+      <w:proofErr w:type="spellEnd"/>
+    </w:p>
+    <w:p>
+      <w:pPr>
+        <w:pStyle w:val="Prrafodelista"/>
+        <w:numPr>
+          <w:ilvl w:val="0"/>
+          <w:numId w:val="7"/>
+        </w:numPr>
+      </w:pPr>
+      <w:r>
+        <w:t>Eclipse</w:t>
+      </w:r>
+    </w:p>
+    <w:p>
+      <w:pPr>
+        <w:pStyle w:val="Prrafodelista"/>
+        <w:numPr>
+          <w:ilvl w:val="0"/>
+          <w:numId w:val="7"/>
+        </w:numPr>
+      </w:pPr>
+      <w:proofErr w:type="spellStart"/>
+      <w:r>
+        <w:t>Hibernate</w:t>
+      </w:r>
+      <w:proofErr w:type="spellEnd"/>
+      <w:r>
+        <w:t xml:space="preserve"> (ORM)</w:t>
+      </w:r>
+    </w:p>
+    <w:p>
+      <w:pPr>
+        <w:pStyle w:val="Prrafodelista"/>
+        <w:numPr>
+          <w:ilvl w:val="0"/>
+          <w:numId w:val="7"/>
+        </w:numPr>
+      </w:pPr>
+      <w:r>
+        <w:t xml:space="preserve">Algoritmos hash </w:t>
+      </w:r>
+    </w:p>
+    <w:p>
+      <w:pPr>
+        <w:pStyle w:val="Prrafodelista"/>
+        <w:numPr>
+          <w:ilvl w:val="0"/>
+          <w:numId w:val="7"/>
+        </w:numPr>
+      </w:pPr>
+      <w:r>
+        <w:t>Junit</w:t>
+      </w:r>
+    </w:p>
+    <w:p>
+      <w:r>
+        <w:t>Para la aplicación Android:</w:t>
+      </w:r>
+    </w:p>
+    <w:p>
+      <w:pPr>
+        <w:pStyle w:val="Prrafodelista"/>
+        <w:numPr>
+          <w:ilvl w:val="0"/>
+          <w:numId w:val="7"/>
+        </w:numPr>
+      </w:pPr>
+      <w:r>
+        <w:t>Android Studio</w:t>
+      </w:r>
+    </w:p>
+    <w:p>
+      <w:pPr>
+        <w:pStyle w:val="Prrafodelista"/>
+        <w:numPr>
+          <w:ilvl w:val="0"/>
+          <w:numId w:val="7"/>
+        </w:numPr>
+      </w:pPr>
+      <w:proofErr w:type="spellStart"/>
+      <w:r>
+        <w:t>Kotlin</w:t>
+      </w:r>
+      <w:proofErr w:type="spellEnd"/>
+    </w:p>
+    <w:p>
+      <w:pPr>
+        <w:pStyle w:val="Prrafodelista"/>
+        <w:numPr>
+          <w:ilvl w:val="0"/>
+          <w:numId w:val="7"/>
+        </w:numPr>
+      </w:pPr>
+      <w:r>
+        <w:t>Para la Base de datos:</w:t>
+      </w:r>
+    </w:p>
+    <w:p>
+      <w:pPr>
+        <w:pStyle w:val="Prrafodelista"/>
+        <w:numPr>
+          <w:ilvl w:val="0"/>
+          <w:numId w:val="7"/>
+        </w:numPr>
+      </w:pPr>
+      <w:r>
+        <w:t>SQL</w:t>
+      </w:r>
+    </w:p>
+    <w:p>
+      <w:pPr>
+        <w:pStyle w:val="Prrafodelista"/>
+        <w:numPr>
+          <w:ilvl w:val="0"/>
+          <w:numId w:val="7"/>
+        </w:numPr>
+      </w:pPr>
+      <w:r>
+        <w:t>MySQL</w:t>
+      </w:r>
+    </w:p>
+    <w:p>
+      <w:pPr>
+        <w:ind w:left="360"/>
+      </w:pPr>
+      <w:r>
+        <w:t xml:space="preserve">Para la Comunicación, Concurrencia y </w:t>
+      </w:r>
+      <w:proofErr w:type="gramStart"/>
+      <w:r>
+        <w:t>Seguridad:.</w:t>
+      </w:r>
+      <w:proofErr w:type="gramEnd"/>
+      <w:r>
+        <w:t xml:space="preserve"> </w:t>
+      </w:r>
+    </w:p>
+    <w:p>
+      <w:pPr>
+        <w:pStyle w:val="Prrafodelista"/>
+        <w:numPr>
+          <w:ilvl w:val="0"/>
+          <w:numId w:val="7"/>
+        </w:numPr>
+      </w:pPr>
+      <w:proofErr w:type="spellStart"/>
+      <w:r>
+        <w:t>Backend</w:t>
+      </w:r>
+      <w:proofErr w:type="spellEnd"/>
+      <w:r>
+        <w:t xml:space="preserve">/Servicios: Desarrollo de un servidor propio basado en una capa de Sockets TCP/IP en Java para gestionar las peticiones concurrentes de los clientes sin atacar directamente a la base de datos.   </w:t>
+      </w:r>
+    </w:p>
+    <w:p>
+      <w:pPr>
+        <w:pStyle w:val="Prrafodelista"/>
+        <w:numPr>
+          <w:ilvl w:val="0"/>
+          <w:numId w:val="7"/>
+        </w:numPr>
+      </w:pPr>
+      <w:r>
+        <w:t xml:space="preserve">Seguridad: Librerías criptográficas de Java para aplicar algoritmos hash y cifrado de datos.  </w:t>
+      </w:r>
+    </w:p>
+    <w:p>
+      <w:pPr>
+        <w:ind w:left="360"/>
+      </w:pPr>
+      <w:r>
+        <w:t xml:space="preserve">Para el Control de Calidad y </w:t>
+      </w:r>
+      <w:proofErr w:type="spellStart"/>
+      <w:proofErr w:type="gramStart"/>
+      <w:r>
+        <w:t>Versiones:Pruebas</w:t>
+      </w:r>
+      <w:proofErr w:type="spellEnd"/>
+      <w:proofErr w:type="gramEnd"/>
+      <w:r>
+        <w:t xml:space="preserve">: </w:t>
+      </w:r>
+    </w:p>
+    <w:p>
+      <w:pPr>
+        <w:pStyle w:val="Prrafodelista"/>
+        <w:numPr>
+          <w:ilvl w:val="0"/>
+          <w:numId w:val="7"/>
+        </w:numPr>
+      </w:pPr>
+      <w:proofErr w:type="spellStart"/>
+      <w:r>
+        <w:t>JUnit</w:t>
+      </w:r>
+      <w:proofErr w:type="spellEnd"/>
+      <w:r>
+        <w:t xml:space="preserve"> para las pruebas unitarias.   </w:t>
+      </w:r>
+    </w:p>
+    <w:p>
+      <w:pPr>
+        <w:pStyle w:val="Prrafodelista"/>
+        <w:numPr>
+          <w:ilvl w:val="0"/>
+          <w:numId w:val="7"/>
+        </w:numPr>
+      </w:pPr>
+      <w:r>
+        <w:t>Repositorio: Git/GitHub para el control de versiones del código fuente</w:t>
+      </w:r>
+    </w:p>
+    <w:p>
+      <w:pPr>
+        <w:pStyle w:val="Prrafodelista"/>
+      </w:pPr>
+    </w:p>
+    <w:p>
       <w:r>
         <w:br w:type="page"/>
       </w:r>
@@ -2106,12 +2828,12 @@
           <w:numId w:val="1"/>
         </w:numPr>
       </w:pPr>
-      <w:bookmarkStart w:id="9" w:name="_Toc159224220"/>
+      <w:bookmarkStart w:id="10" w:name="_Toc241172032"/>
       <w:r>
         <w:lastRenderedPageBreak/>
         <w:t>Planificación, Diagnóstico y Contexto Laboral</w:t>
       </w:r>
-      <w:bookmarkEnd w:id="9"/>
+      <w:bookmarkEnd w:id="10"/>
       <w:r>
         <w:t xml:space="preserve"> </w:t>
       </w:r>
@@ -2134,12 +2856,12 @@
           <w:numId w:val="1"/>
         </w:numPr>
       </w:pPr>
-      <w:bookmarkStart w:id="10" w:name="_Toc159224221"/>
+      <w:bookmarkStart w:id="11" w:name="_Toc241172033"/>
       <w:r>
         <w:lastRenderedPageBreak/>
         <w:t>Análisis del proyecto</w:t>
       </w:r>
-      <w:bookmarkEnd w:id="10"/>
+      <w:bookmarkEnd w:id="11"/>
       <w:r>
         <w:t xml:space="preserve"> </w:t>
       </w:r>
@@ -2163,12 +2885,12 @@
           <w:numId w:val="1"/>
         </w:numPr>
       </w:pPr>
-      <w:bookmarkStart w:id="11" w:name="_Toc159224222"/>
+      <w:bookmarkStart w:id="12" w:name="_Toc241172034"/>
       <w:r>
         <w:lastRenderedPageBreak/>
         <w:t>Diseño del proyecto</w:t>
       </w:r>
-      <w:bookmarkEnd w:id="11"/>
+      <w:bookmarkEnd w:id="12"/>
       <w:r>
         <w:t xml:space="preserve"> </w:t>
       </w:r>
@@ -2178,6 +2900,1209 @@
         <w:t>(6-14 páginas)</w:t>
       </w:r>
     </w:p>
+    <w:p>
+      <w:pPr>
+        <w:pStyle w:val="Ttulo2"/>
+      </w:pPr>
+      <w:bookmarkStart w:id="13" w:name="_Toc241172014"/>
+      <w:r>
+        <w:t>necesidades y la finalidad</w:t>
+      </w:r>
+      <w:bookmarkEnd w:id="13"/>
+    </w:p>
+    <w:p>
+      <w:r>
+        <w:t>Recopilar información del cliente.</w:t>
+      </w:r>
+    </w:p>
+    <w:p>
+      <w:pPr>
+        <w:pStyle w:val="Ttulo2"/>
+      </w:pPr>
+      <w:bookmarkStart w:id="14" w:name="_Toc241172015"/>
+      <w:r>
+        <w:t>requisitos funcionales y no funcionale</w:t>
+      </w:r>
+      <w:r>
+        <w:t>s</w:t>
+      </w:r>
+      <w:bookmarkEnd w:id="14"/>
+    </w:p>
+    <w:p/>
+    <w:p>
+      <w:pPr>
+        <w:pStyle w:val="Ttulo2"/>
+      </w:pPr>
+      <w:bookmarkStart w:id="15" w:name="_Toc241172016"/>
+      <w:r>
+        <w:t>diagramas de Entidad-Relación</w:t>
+      </w:r>
+      <w:bookmarkEnd w:id="15"/>
+    </w:p>
+    <w:p>
+      <w:r>
+        <w:t>Guia para la construcción de E-R:</w:t>
+      </w:r>
+    </w:p>
+    <w:p>
+      <w:pPr>
+        <w:pStyle w:val="Prrafodelista"/>
+        <w:numPr>
+          <w:ilvl w:val="0"/>
+          <w:numId w:val="8"/>
+        </w:numPr>
+        <w:suppressAutoHyphens/>
+        <w:autoSpaceDN w:val="0"/>
+        <w:spacing w:before="0" w:after="160" w:line="278" w:lineRule="auto"/>
+        <w:jc w:val="left"/>
+        <w:textAlignment w:val="baseline"/>
+      </w:pPr>
+      <w:r>
+        <w:t>Entender el problema</w:t>
+      </w:r>
+    </w:p>
+    <w:p>
+      <w:pPr>
+        <w:pStyle w:val="Prrafodelista"/>
+        <w:numPr>
+          <w:ilvl w:val="0"/>
+          <w:numId w:val="8"/>
+        </w:numPr>
+        <w:suppressAutoHyphens/>
+        <w:autoSpaceDN w:val="0"/>
+        <w:spacing w:before="0" w:after="160" w:line="278" w:lineRule="auto"/>
+        <w:jc w:val="left"/>
+        <w:textAlignment w:val="baseline"/>
+      </w:pPr>
+      <w:r>
+        <w:t>Identificar tipos de entidades</w:t>
+      </w:r>
+    </w:p>
+    <w:p>
+      <w:pPr>
+        <w:pStyle w:val="Prrafodelista"/>
+        <w:numPr>
+          <w:ilvl w:val="0"/>
+          <w:numId w:val="8"/>
+        </w:numPr>
+        <w:suppressAutoHyphens/>
+        <w:autoSpaceDN w:val="0"/>
+        <w:spacing w:before="0" w:after="160" w:line="278" w:lineRule="auto"/>
+        <w:jc w:val="left"/>
+        <w:textAlignment w:val="baseline"/>
+      </w:pPr>
+      <w:r>
+        <w:t>Identificar tipos de relaciones</w:t>
+      </w:r>
+    </w:p>
+    <w:p>
+      <w:pPr>
+        <w:pStyle w:val="Prrafodelista"/>
+        <w:numPr>
+          <w:ilvl w:val="0"/>
+          <w:numId w:val="8"/>
+        </w:numPr>
+        <w:suppressAutoHyphens/>
+        <w:autoSpaceDN w:val="0"/>
+        <w:spacing w:before="0" w:after="160" w:line="278" w:lineRule="auto"/>
+        <w:jc w:val="left"/>
+        <w:textAlignment w:val="baseline"/>
+      </w:pPr>
+      <w:r>
+        <w:t>Buscar las cardinalidades</w:t>
+      </w:r>
+    </w:p>
+    <w:p>
+      <w:pPr>
+        <w:pStyle w:val="Prrafodelista"/>
+        <w:numPr>
+          <w:ilvl w:val="0"/>
+          <w:numId w:val="8"/>
+        </w:numPr>
+        <w:suppressAutoHyphens/>
+        <w:autoSpaceDN w:val="0"/>
+        <w:spacing w:before="0" w:after="160" w:line="278" w:lineRule="auto"/>
+        <w:jc w:val="left"/>
+        <w:textAlignment w:val="baseline"/>
+      </w:pPr>
+      <w:r>
+        <w:t>Identificar los atributos de cada entidad</w:t>
+      </w:r>
+    </w:p>
+    <w:p>
+      <w:pPr>
+        <w:pStyle w:val="Prrafodelista"/>
+        <w:numPr>
+          <w:ilvl w:val="0"/>
+          <w:numId w:val="8"/>
+        </w:numPr>
+        <w:suppressAutoHyphens/>
+        <w:autoSpaceDN w:val="0"/>
+        <w:spacing w:before="0" w:after="160" w:line="278" w:lineRule="auto"/>
+        <w:jc w:val="left"/>
+        <w:textAlignment w:val="baseline"/>
+      </w:pPr>
+      <w:r>
+        <w:t>Identificar las claves de cada entidad</w:t>
+      </w:r>
+    </w:p>
+    <w:p>
+      <w:r>
+        <w:t>El problema es tener una base de datos para que gestione la empresa, tanto para pacientes como para trabajadores y donde se pueda consultar e introducir datos de ellos.</w:t>
+      </w:r>
+    </w:p>
+    <w:p>
+      <w:r>
+        <w:t>Las entidades:</w:t>
+      </w:r>
+    </w:p>
+    <w:p>
+      <w:pPr>
+        <w:pStyle w:val="Prrafodelista"/>
+        <w:numPr>
+          <w:ilvl w:val="0"/>
+          <w:numId w:val="9"/>
+        </w:numPr>
+        <w:suppressAutoHyphens/>
+        <w:autoSpaceDN w:val="0"/>
+        <w:spacing w:before="0" w:after="160" w:line="278" w:lineRule="auto"/>
+        <w:jc w:val="left"/>
+        <w:textAlignment w:val="baseline"/>
+        <w:rPr>
+          <w:b/>
+          <w:bCs/>
+        </w:rPr>
+      </w:pPr>
+      <w:r>
+        <w:rPr>
+          <w:b/>
+          <w:bCs/>
+        </w:rPr>
+        <w:t>Paciente registrado</w:t>
+      </w:r>
+    </w:p>
+    <w:p>
+      <w:pPr>
+        <w:pStyle w:val="Prrafodelista"/>
+        <w:numPr>
+          <w:ilvl w:val="0"/>
+          <w:numId w:val="9"/>
+        </w:numPr>
+        <w:suppressAutoHyphens/>
+        <w:autoSpaceDN w:val="0"/>
+        <w:spacing w:before="0" w:after="160" w:line="278" w:lineRule="auto"/>
+        <w:jc w:val="left"/>
+        <w:textAlignment w:val="baseline"/>
+        <w:rPr>
+          <w:b/>
+          <w:bCs/>
+        </w:rPr>
+      </w:pPr>
+      <w:r>
+        <w:rPr>
+          <w:b/>
+          <w:bCs/>
+        </w:rPr>
+        <w:t>Especialista</w:t>
+      </w:r>
+      <w:r>
+        <w:rPr>
+          <w:b/>
+          <w:bCs/>
+        </w:rPr>
+        <w:br/>
+      </w:r>
+      <w:r>
+        <w:t>Tipos:</w:t>
+      </w:r>
+    </w:p>
+    <w:p>
+      <w:pPr>
+        <w:pStyle w:val="Prrafodelista"/>
+        <w:numPr>
+          <w:ilvl w:val="1"/>
+          <w:numId w:val="9"/>
+        </w:numPr>
+        <w:suppressAutoHyphens/>
+        <w:autoSpaceDN w:val="0"/>
+        <w:spacing w:before="0" w:after="160" w:line="278" w:lineRule="auto"/>
+        <w:jc w:val="left"/>
+        <w:textAlignment w:val="baseline"/>
+      </w:pPr>
+      <w:r>
+        <w:t xml:space="preserve">Ginecología </w:t>
+      </w:r>
+    </w:p>
+    <w:p>
+      <w:pPr>
+        <w:pStyle w:val="Prrafodelista"/>
+        <w:numPr>
+          <w:ilvl w:val="1"/>
+          <w:numId w:val="9"/>
+        </w:numPr>
+        <w:suppressAutoHyphens/>
+        <w:autoSpaceDN w:val="0"/>
+        <w:spacing w:before="0" w:after="160" w:line="278" w:lineRule="auto"/>
+        <w:jc w:val="left"/>
+        <w:textAlignment w:val="baseline"/>
+      </w:pPr>
+      <w:r>
+        <w:t xml:space="preserve"> Análisis clínicos </w:t>
+      </w:r>
+    </w:p>
+    <w:p>
+      <w:pPr>
+        <w:pStyle w:val="Prrafodelista"/>
+        <w:numPr>
+          <w:ilvl w:val="1"/>
+          <w:numId w:val="9"/>
+        </w:numPr>
+        <w:suppressAutoHyphens/>
+        <w:autoSpaceDN w:val="0"/>
+        <w:spacing w:before="0" w:after="160" w:line="278" w:lineRule="auto"/>
+        <w:jc w:val="left"/>
+        <w:textAlignment w:val="baseline"/>
+      </w:pPr>
+      <w:r>
+        <w:t xml:space="preserve"> </w:t>
+      </w:r>
+      <w:proofErr w:type="spellStart"/>
+      <w:r>
+        <w:t>Pedriatria</w:t>
+      </w:r>
+      <w:proofErr w:type="spellEnd"/>
+      <w:r>
+        <w:t xml:space="preserve"> </w:t>
+      </w:r>
+    </w:p>
+    <w:p>
+      <w:pPr>
+        <w:pStyle w:val="Prrafodelista"/>
+        <w:numPr>
+          <w:ilvl w:val="1"/>
+          <w:numId w:val="9"/>
+        </w:numPr>
+        <w:suppressAutoHyphens/>
+        <w:autoSpaceDN w:val="0"/>
+        <w:spacing w:before="0" w:after="160" w:line="278" w:lineRule="auto"/>
+        <w:jc w:val="left"/>
+        <w:textAlignment w:val="baseline"/>
+      </w:pPr>
+      <w:r>
+        <w:t xml:space="preserve"> Alergología </w:t>
+      </w:r>
+    </w:p>
+    <w:p>
+      <w:pPr>
+        <w:pStyle w:val="Prrafodelista"/>
+        <w:numPr>
+          <w:ilvl w:val="1"/>
+          <w:numId w:val="9"/>
+        </w:numPr>
+        <w:suppressAutoHyphens/>
+        <w:autoSpaceDN w:val="0"/>
+        <w:spacing w:before="0" w:after="160" w:line="278" w:lineRule="auto"/>
+        <w:jc w:val="left"/>
+        <w:textAlignment w:val="baseline"/>
+      </w:pPr>
+      <w:r>
+        <w:t xml:space="preserve"> Aparato digestivo </w:t>
+      </w:r>
+    </w:p>
+    <w:p>
+      <w:pPr>
+        <w:pStyle w:val="Prrafodelista"/>
+        <w:numPr>
+          <w:ilvl w:val="1"/>
+          <w:numId w:val="9"/>
+        </w:numPr>
+        <w:suppressAutoHyphens/>
+        <w:autoSpaceDN w:val="0"/>
+        <w:spacing w:before="0" w:after="160" w:line="278" w:lineRule="auto"/>
+        <w:jc w:val="left"/>
+        <w:textAlignment w:val="baseline"/>
+      </w:pPr>
+      <w:r>
+        <w:t xml:space="preserve"> Cardiología </w:t>
+      </w:r>
+    </w:p>
+    <w:p>
+      <w:pPr>
+        <w:pStyle w:val="Prrafodelista"/>
+        <w:numPr>
+          <w:ilvl w:val="1"/>
+          <w:numId w:val="9"/>
+        </w:numPr>
+        <w:suppressAutoHyphens/>
+        <w:autoSpaceDN w:val="0"/>
+        <w:spacing w:before="0" w:after="160" w:line="278" w:lineRule="auto"/>
+        <w:jc w:val="left"/>
+        <w:textAlignment w:val="baseline"/>
+      </w:pPr>
+      <w:r>
+        <w:t xml:space="preserve"> Oftalmología </w:t>
+      </w:r>
+    </w:p>
+    <w:p>
+      <w:pPr>
+        <w:pStyle w:val="Prrafodelista"/>
+        <w:numPr>
+          <w:ilvl w:val="1"/>
+          <w:numId w:val="9"/>
+        </w:numPr>
+        <w:suppressAutoHyphens/>
+        <w:autoSpaceDN w:val="0"/>
+        <w:spacing w:before="0" w:after="160" w:line="278" w:lineRule="auto"/>
+        <w:jc w:val="left"/>
+        <w:textAlignment w:val="baseline"/>
+      </w:pPr>
+      <w:r>
+        <w:t xml:space="preserve"> Dermatología </w:t>
+      </w:r>
+    </w:p>
+    <w:p>
+      <w:pPr>
+        <w:pStyle w:val="Prrafodelista"/>
+        <w:numPr>
+          <w:ilvl w:val="1"/>
+          <w:numId w:val="9"/>
+        </w:numPr>
+        <w:suppressAutoHyphens/>
+        <w:autoSpaceDN w:val="0"/>
+        <w:spacing w:before="0" w:after="160" w:line="278" w:lineRule="auto"/>
+        <w:jc w:val="left"/>
+        <w:textAlignment w:val="baseline"/>
+      </w:pPr>
+      <w:r>
+        <w:t xml:space="preserve"> Endocrino y Nutrición </w:t>
+      </w:r>
+    </w:p>
+    <w:p>
+      <w:pPr>
+        <w:pStyle w:val="Prrafodelista"/>
+        <w:numPr>
+          <w:ilvl w:val="0"/>
+          <w:numId w:val="9"/>
+        </w:numPr>
+        <w:suppressAutoHyphens/>
+        <w:autoSpaceDN w:val="0"/>
+        <w:spacing w:before="0" w:after="160" w:line="278" w:lineRule="auto"/>
+        <w:jc w:val="left"/>
+        <w:textAlignment w:val="baseline"/>
+        <w:rPr>
+          <w:b/>
+          <w:bCs/>
+        </w:rPr>
+      </w:pPr>
+      <w:r>
+        <w:rPr>
+          <w:b/>
+          <w:bCs/>
+        </w:rPr>
+        <w:t>Trabajadores</w:t>
+      </w:r>
+      <w:r>
+        <w:rPr>
+          <w:b/>
+          <w:bCs/>
+        </w:rPr>
+        <w:br/>
+      </w:r>
+      <w:r>
+        <w:t>Tipos:</w:t>
+      </w:r>
+    </w:p>
+    <w:p>
+      <w:pPr>
+        <w:pStyle w:val="Prrafodelista"/>
+        <w:numPr>
+          <w:ilvl w:val="1"/>
+          <w:numId w:val="9"/>
+        </w:numPr>
+        <w:suppressAutoHyphens/>
+        <w:autoSpaceDN w:val="0"/>
+        <w:spacing w:before="0" w:after="160" w:line="278" w:lineRule="auto"/>
+        <w:jc w:val="left"/>
+        <w:textAlignment w:val="baseline"/>
+      </w:pPr>
+      <w:r>
+        <w:t>Recepcionista</w:t>
+      </w:r>
+    </w:p>
+    <w:p>
+      <w:pPr>
+        <w:pStyle w:val="Prrafodelista"/>
+        <w:numPr>
+          <w:ilvl w:val="1"/>
+          <w:numId w:val="9"/>
+        </w:numPr>
+        <w:suppressAutoHyphens/>
+        <w:autoSpaceDN w:val="0"/>
+        <w:spacing w:before="0" w:after="160" w:line="278" w:lineRule="auto"/>
+        <w:jc w:val="left"/>
+        <w:textAlignment w:val="baseline"/>
+      </w:pPr>
+      <w:r>
+        <w:t>Enfermeros</w:t>
+      </w:r>
+    </w:p>
+    <w:p>
+      <w:pPr>
+        <w:pStyle w:val="Prrafodelista"/>
+        <w:numPr>
+          <w:ilvl w:val="1"/>
+          <w:numId w:val="9"/>
+        </w:numPr>
+        <w:suppressAutoHyphens/>
+        <w:autoSpaceDN w:val="0"/>
+        <w:spacing w:before="0" w:after="160" w:line="278" w:lineRule="auto"/>
+        <w:jc w:val="left"/>
+        <w:textAlignment w:val="baseline"/>
+      </w:pPr>
+      <w:r>
+        <w:t>Médicos</w:t>
+      </w:r>
+    </w:p>
+    <w:p>
+      <w:pPr>
+        <w:pStyle w:val="Prrafodelista"/>
+        <w:numPr>
+          <w:ilvl w:val="0"/>
+          <w:numId w:val="9"/>
+        </w:numPr>
+        <w:suppressAutoHyphens/>
+        <w:autoSpaceDN w:val="0"/>
+        <w:spacing w:before="0" w:after="160" w:line="278" w:lineRule="auto"/>
+        <w:jc w:val="left"/>
+        <w:textAlignment w:val="baseline"/>
+        <w:rPr>
+          <w:b/>
+          <w:bCs/>
+        </w:rPr>
+      </w:pPr>
+      <w:r>
+        <w:rPr>
+          <w:b/>
+          <w:bCs/>
+        </w:rPr>
+        <w:t>Citas</w:t>
+      </w:r>
+    </w:p>
+    <w:p>
+      <w:pPr>
+        <w:pStyle w:val="Prrafodelista"/>
+        <w:numPr>
+          <w:ilvl w:val="0"/>
+          <w:numId w:val="9"/>
+        </w:numPr>
+        <w:suppressAutoHyphens/>
+        <w:autoSpaceDN w:val="0"/>
+        <w:spacing w:before="0" w:after="160" w:line="278" w:lineRule="auto"/>
+        <w:jc w:val="left"/>
+        <w:textAlignment w:val="baseline"/>
+        <w:rPr>
+          <w:b/>
+          <w:bCs/>
+        </w:rPr>
+      </w:pPr>
+      <w:proofErr w:type="spellStart"/>
+      <w:r>
+        <w:rPr>
+          <w:b/>
+          <w:bCs/>
+        </w:rPr>
+        <w:t>Historial_Medico</w:t>
+      </w:r>
+      <w:proofErr w:type="spellEnd"/>
+    </w:p>
+    <w:p>
+      <w:pPr>
+        <w:pStyle w:val="Prrafodelista"/>
+        <w:numPr>
+          <w:ilvl w:val="0"/>
+          <w:numId w:val="9"/>
+        </w:numPr>
+        <w:suppressAutoHyphens/>
+        <w:autoSpaceDN w:val="0"/>
+        <w:spacing w:before="0" w:after="160" w:line="278" w:lineRule="auto"/>
+        <w:jc w:val="left"/>
+        <w:textAlignment w:val="baseline"/>
+        <w:rPr>
+          <w:b/>
+          <w:bCs/>
+        </w:rPr>
+      </w:pPr>
+      <w:proofErr w:type="spellStart"/>
+      <w:r>
+        <w:rPr>
+          <w:b/>
+          <w:bCs/>
+        </w:rPr>
+        <w:lastRenderedPageBreak/>
+        <w:t>Horario_Laboral</w:t>
+      </w:r>
+      <w:proofErr w:type="spellEnd"/>
+    </w:p>
+    <w:p>
+      <w:r>
+        <w:t>Las relaciones y Cardinalidades:</w:t>
+      </w:r>
+    </w:p>
+    <w:p>
+      <w:pPr>
+        <w:pStyle w:val="Prrafodelista"/>
+        <w:numPr>
+          <w:ilvl w:val="0"/>
+          <w:numId w:val="11"/>
+        </w:numPr>
+        <w:suppressAutoHyphens/>
+        <w:autoSpaceDN w:val="0"/>
+        <w:spacing w:before="0" w:after="160" w:line="278" w:lineRule="auto"/>
+        <w:jc w:val="left"/>
+        <w:textAlignment w:val="baseline"/>
+      </w:pPr>
+      <w:r>
+        <w:t>Paciente — Cita (0, N) / (1, 1): Un paciente puede tener registradas desde 0 hasta N citas; una cita pertenece obligatoriamente a 1 paciente.</w:t>
+      </w:r>
+    </w:p>
+    <w:p>
+      <w:pPr>
+        <w:pStyle w:val="Prrafodelista"/>
+        <w:numPr>
+          <w:ilvl w:val="0"/>
+          <w:numId w:val="11"/>
+        </w:numPr>
+        <w:suppressAutoHyphens/>
+        <w:autoSpaceDN w:val="0"/>
+        <w:spacing w:before="0" w:after="160" w:line="278" w:lineRule="auto"/>
+        <w:jc w:val="left"/>
+        <w:textAlignment w:val="baseline"/>
+      </w:pPr>
+      <w:r>
+        <w:t>Médico — Cita (0, N) / (1, 1): Un médico puede atender desde 0 hasta N citas; cada cita es atendida por 1 médico.</w:t>
+      </w:r>
+    </w:p>
+    <w:p>
+      <w:pPr>
+        <w:pStyle w:val="Prrafodelista"/>
+        <w:numPr>
+          <w:ilvl w:val="0"/>
+          <w:numId w:val="11"/>
+        </w:numPr>
+        <w:suppressAutoHyphens/>
+        <w:autoSpaceDN w:val="0"/>
+        <w:spacing w:before="0" w:after="160" w:line="278" w:lineRule="auto"/>
+        <w:jc w:val="left"/>
+        <w:textAlignment w:val="baseline"/>
+      </w:pPr>
+      <w:r>
+        <w:t>Especialidad — Médico (1, N) / (1, 1): Una especialidad cuenta con 1 o varios médicos; cada médico pertenece a 1 especialidad titular.</w:t>
+      </w:r>
+    </w:p>
+    <w:p>
+      <w:pPr>
+        <w:pStyle w:val="Prrafodelista"/>
+        <w:numPr>
+          <w:ilvl w:val="0"/>
+          <w:numId w:val="11"/>
+        </w:numPr>
+        <w:suppressAutoHyphens/>
+        <w:autoSpaceDN w:val="0"/>
+        <w:spacing w:before="0" w:after="160" w:line="278" w:lineRule="auto"/>
+        <w:jc w:val="left"/>
+        <w:textAlignment w:val="baseline"/>
+      </w:pPr>
+      <w:r>
+        <w:t xml:space="preserve">Trabajador — </w:t>
+      </w:r>
+      <w:proofErr w:type="spellStart"/>
+      <w:r>
+        <w:t>Horario_Laboral</w:t>
+      </w:r>
+      <w:proofErr w:type="spellEnd"/>
+      <w:r>
+        <w:t xml:space="preserve"> (1, N) / (1, 1): Un trabajador tiene de 1 a N turnos registrados; cada turno corresponde a 1 trabajador.</w:t>
+      </w:r>
+    </w:p>
+    <w:p>
+      <w:pPr>
+        <w:pStyle w:val="Prrafodelista"/>
+        <w:numPr>
+          <w:ilvl w:val="0"/>
+          <w:numId w:val="11"/>
+        </w:numPr>
+        <w:suppressAutoHyphens/>
+        <w:autoSpaceDN w:val="0"/>
+        <w:spacing w:before="0" w:after="160" w:line="278" w:lineRule="auto"/>
+        <w:jc w:val="left"/>
+        <w:textAlignment w:val="baseline"/>
+      </w:pPr>
+      <w:r>
+        <w:t xml:space="preserve">Paciente — </w:t>
+      </w:r>
+      <w:proofErr w:type="spellStart"/>
+      <w:r>
+        <w:t>Historial_Medico</w:t>
+      </w:r>
+      <w:proofErr w:type="spellEnd"/>
+      <w:r>
+        <w:t xml:space="preserve"> (0, N</w:t>
+      </w:r>
+      <w:proofErr w:type="gramStart"/>
+      <w:r>
+        <w:t>) :</w:t>
+      </w:r>
+      <w:proofErr w:type="gramEnd"/>
+      <w:r>
+        <w:t xml:space="preserve"> (1, 1)</w:t>
+      </w:r>
+    </w:p>
+    <w:p>
+      <w:pPr>
+        <w:pStyle w:val="Prrafodelista"/>
+        <w:numPr>
+          <w:ilvl w:val="0"/>
+          <w:numId w:val="11"/>
+        </w:numPr>
+        <w:suppressAutoHyphens/>
+        <w:autoSpaceDN w:val="0"/>
+        <w:spacing w:before="0" w:after="160" w:line="278" w:lineRule="auto"/>
+        <w:jc w:val="left"/>
+        <w:textAlignment w:val="baseline"/>
+      </w:pPr>
+      <w:r>
+        <w:t xml:space="preserve">Cita — </w:t>
+      </w:r>
+      <w:proofErr w:type="spellStart"/>
+      <w:r>
+        <w:t>Historial_Medico</w:t>
+      </w:r>
+      <w:proofErr w:type="spellEnd"/>
+      <w:r>
+        <w:t xml:space="preserve"> (0, 1</w:t>
+      </w:r>
+      <w:proofErr w:type="gramStart"/>
+      <w:r>
+        <w:t>) :</w:t>
+      </w:r>
+      <w:proofErr w:type="gramEnd"/>
+      <w:r>
+        <w:t xml:space="preserve"> (1, 1)</w:t>
+      </w:r>
+    </w:p>
+    <w:p>
+      <w:r>
+        <w:t>Los atributos y claves de cada entidad:</w:t>
+      </w:r>
+    </w:p>
+    <w:p>
+      <w:pPr>
+        <w:pStyle w:val="Prrafodelista"/>
+        <w:numPr>
+          <w:ilvl w:val="0"/>
+          <w:numId w:val="10"/>
+        </w:numPr>
+        <w:suppressAutoHyphens/>
+        <w:autoSpaceDN w:val="0"/>
+        <w:spacing w:before="0" w:after="160" w:line="278" w:lineRule="auto"/>
+        <w:jc w:val="left"/>
+        <w:textAlignment w:val="baseline"/>
+      </w:pPr>
+      <w:proofErr w:type="spellStart"/>
+      <w:r>
+        <w:rPr>
+          <w:b/>
+          <w:bCs/>
+        </w:rPr>
+        <w:t>Horario_Laboral</w:t>
+      </w:r>
+      <w:proofErr w:type="spellEnd"/>
+      <w:r>
+        <w:t xml:space="preserve">: </w:t>
+      </w:r>
+      <w:proofErr w:type="spellStart"/>
+      <w:r>
+        <w:t>id_horario</w:t>
+      </w:r>
+      <w:proofErr w:type="spellEnd"/>
+      <w:r>
+        <w:t xml:space="preserve"> (PK), </w:t>
+      </w:r>
+      <w:proofErr w:type="spellStart"/>
+      <w:r>
+        <w:t>id_trabajador</w:t>
+      </w:r>
+      <w:proofErr w:type="spellEnd"/>
+      <w:r>
+        <w:t xml:space="preserve"> (FK), </w:t>
+      </w:r>
+      <w:proofErr w:type="spellStart"/>
+      <w:r>
+        <w:t>dia_semana</w:t>
+      </w:r>
+      <w:proofErr w:type="spellEnd"/>
+      <w:r>
+        <w:t xml:space="preserve"> (o fecha), </w:t>
+      </w:r>
+      <w:proofErr w:type="spellStart"/>
+      <w:r>
+        <w:t>hora_inicio</w:t>
+      </w:r>
+      <w:proofErr w:type="spellEnd"/>
+      <w:r>
+        <w:t xml:space="preserve">, </w:t>
+      </w:r>
+      <w:proofErr w:type="spellStart"/>
+      <w:r>
+        <w:t>hora_fin</w:t>
+      </w:r>
+      <w:proofErr w:type="spellEnd"/>
+      <w:r>
+        <w:t xml:space="preserve">, </w:t>
+      </w:r>
+      <w:proofErr w:type="spellStart"/>
+      <w:r>
+        <w:t>tipo_jornada</w:t>
+      </w:r>
+      <w:proofErr w:type="spellEnd"/>
+      <w:r>
+        <w:t xml:space="preserve"> / </w:t>
+      </w:r>
+      <w:proofErr w:type="spellStart"/>
+      <w:r>
+        <w:t>es_festivo</w:t>
+      </w:r>
+      <w:proofErr w:type="spellEnd"/>
+      <w:r>
+        <w:t>.</w:t>
+      </w:r>
+    </w:p>
+    <w:p>
+      <w:pPr>
+        <w:pStyle w:val="Prrafodelista"/>
+        <w:numPr>
+          <w:ilvl w:val="0"/>
+          <w:numId w:val="10"/>
+        </w:numPr>
+        <w:suppressAutoHyphens/>
+        <w:autoSpaceDN w:val="0"/>
+        <w:spacing w:before="0" w:after="160" w:line="278" w:lineRule="auto"/>
+        <w:jc w:val="left"/>
+        <w:textAlignment w:val="baseline"/>
+      </w:pPr>
+      <w:r>
+        <w:rPr>
+          <w:b/>
+          <w:bCs/>
+        </w:rPr>
+        <w:t>Paciente</w:t>
+      </w:r>
+      <w:r>
+        <w:t xml:space="preserve">: </w:t>
+      </w:r>
+      <w:proofErr w:type="spellStart"/>
+      <w:r>
+        <w:t>id_paciente</w:t>
+      </w:r>
+      <w:proofErr w:type="spellEnd"/>
+      <w:r>
+        <w:t xml:space="preserve"> (PK), </w:t>
+      </w:r>
+      <w:proofErr w:type="spellStart"/>
+      <w:r>
+        <w:t>dni</w:t>
+      </w:r>
+      <w:proofErr w:type="spellEnd"/>
+      <w:r>
+        <w:t xml:space="preserve">, nombre, apellidos, </w:t>
+      </w:r>
+      <w:proofErr w:type="spellStart"/>
+      <w:r>
+        <w:t>telefono</w:t>
+      </w:r>
+      <w:proofErr w:type="spellEnd"/>
+      <w:r>
+        <w:t xml:space="preserve">, email, </w:t>
+      </w:r>
+      <w:proofErr w:type="spellStart"/>
+      <w:r>
+        <w:t>historial_clinico</w:t>
+      </w:r>
+      <w:proofErr w:type="spellEnd"/>
+      <w:r>
+        <w:t>.</w:t>
+      </w:r>
+    </w:p>
+    <w:p>
+      <w:pPr>
+        <w:pStyle w:val="Prrafodelista"/>
+        <w:numPr>
+          <w:ilvl w:val="0"/>
+          <w:numId w:val="10"/>
+        </w:numPr>
+        <w:suppressAutoHyphens/>
+        <w:autoSpaceDN w:val="0"/>
+        <w:spacing w:before="0" w:after="160" w:line="278" w:lineRule="auto"/>
+        <w:jc w:val="left"/>
+        <w:textAlignment w:val="baseline"/>
+      </w:pPr>
+      <w:r>
+        <w:rPr>
+          <w:b/>
+          <w:bCs/>
+        </w:rPr>
+        <w:t>Trabajador:</w:t>
+      </w:r>
+      <w:r>
+        <w:t xml:space="preserve"> </w:t>
+      </w:r>
+      <w:proofErr w:type="spellStart"/>
+      <w:r>
+        <w:t>id_trabajador</w:t>
+      </w:r>
+      <w:proofErr w:type="spellEnd"/>
+      <w:r>
+        <w:t xml:space="preserve"> (PK), </w:t>
+      </w:r>
+      <w:proofErr w:type="spellStart"/>
+      <w:r>
+        <w:t>dni</w:t>
+      </w:r>
+      <w:proofErr w:type="spellEnd"/>
+      <w:r>
+        <w:t xml:space="preserve">, nombre, apellidos, rol (Recepcionista, Enfermero, Médico), </w:t>
+      </w:r>
+      <w:proofErr w:type="spellStart"/>
+      <w:r>
+        <w:t>id_especialidad</w:t>
+      </w:r>
+      <w:proofErr w:type="spellEnd"/>
+      <w:r>
+        <w:t xml:space="preserve"> (FK, </w:t>
+      </w:r>
+      <w:proofErr w:type="spellStart"/>
+      <w:r>
+        <w:t>nullable</w:t>
+      </w:r>
+      <w:proofErr w:type="spellEnd"/>
+      <w:r>
+        <w:t xml:space="preserve"> si no es médico), usuario, </w:t>
+      </w:r>
+      <w:proofErr w:type="spellStart"/>
+      <w:r>
+        <w:t>password_hash</w:t>
+      </w:r>
+      <w:proofErr w:type="spellEnd"/>
+      <w:r>
+        <w:t>.</w:t>
+      </w:r>
+    </w:p>
+    <w:p>
+      <w:pPr>
+        <w:pStyle w:val="Prrafodelista"/>
+        <w:numPr>
+          <w:ilvl w:val="0"/>
+          <w:numId w:val="10"/>
+        </w:numPr>
+        <w:suppressAutoHyphens/>
+        <w:autoSpaceDN w:val="0"/>
+        <w:spacing w:before="0" w:after="160" w:line="278" w:lineRule="auto"/>
+        <w:jc w:val="left"/>
+        <w:textAlignment w:val="baseline"/>
+      </w:pPr>
+      <w:r>
+        <w:rPr>
+          <w:b/>
+          <w:bCs/>
+        </w:rPr>
+        <w:t>Especialidad</w:t>
+      </w:r>
+      <w:r>
+        <w:t xml:space="preserve">: </w:t>
+      </w:r>
+      <w:proofErr w:type="spellStart"/>
+      <w:r>
+        <w:t>id_especialidad</w:t>
+      </w:r>
+      <w:proofErr w:type="spellEnd"/>
+      <w:r>
+        <w:t xml:space="preserve"> (PK), </w:t>
+      </w:r>
+      <w:proofErr w:type="spellStart"/>
+      <w:r>
+        <w:t>nombre_especialidad</w:t>
+      </w:r>
+      <w:proofErr w:type="spellEnd"/>
+      <w:r>
+        <w:t xml:space="preserve"> (Cardiología, Pediatría, Dermatología, etc.), </w:t>
+      </w:r>
+      <w:proofErr w:type="spellStart"/>
+      <w:r>
+        <w:t>descripcion</w:t>
+      </w:r>
+      <w:proofErr w:type="spellEnd"/>
+      <w:r>
+        <w:t>.</w:t>
+      </w:r>
+    </w:p>
+    <w:p>
+      <w:pPr>
+        <w:pStyle w:val="Prrafodelista"/>
+        <w:numPr>
+          <w:ilvl w:val="0"/>
+          <w:numId w:val="10"/>
+        </w:numPr>
+        <w:suppressAutoHyphens/>
+        <w:autoSpaceDN w:val="0"/>
+        <w:spacing w:before="0" w:after="160" w:line="278" w:lineRule="auto"/>
+        <w:jc w:val="left"/>
+        <w:textAlignment w:val="baseline"/>
+      </w:pPr>
+      <w:r>
+        <w:rPr>
+          <w:b/>
+          <w:bCs/>
+        </w:rPr>
+        <w:t>Cita:</w:t>
+      </w:r>
+      <w:r>
+        <w:t xml:space="preserve"> </w:t>
+      </w:r>
+      <w:proofErr w:type="spellStart"/>
+      <w:r>
+        <w:t>id_cita</w:t>
+      </w:r>
+      <w:proofErr w:type="spellEnd"/>
+      <w:r>
+        <w:t xml:space="preserve"> (PK), </w:t>
+      </w:r>
+      <w:proofErr w:type="spellStart"/>
+      <w:r>
+        <w:t>id_paciente</w:t>
+      </w:r>
+      <w:proofErr w:type="spellEnd"/>
+      <w:r>
+        <w:t xml:space="preserve"> (FK), </w:t>
+      </w:r>
+      <w:proofErr w:type="spellStart"/>
+      <w:r>
+        <w:t>id_trabajador</w:t>
+      </w:r>
+      <w:proofErr w:type="spellEnd"/>
+      <w:r>
+        <w:t xml:space="preserve"> (FK, médico asignado), </w:t>
+      </w:r>
+      <w:proofErr w:type="spellStart"/>
+      <w:r>
+        <w:t>fecha_hora</w:t>
+      </w:r>
+      <w:proofErr w:type="spellEnd"/>
+      <w:r>
+        <w:t xml:space="preserve">, estado (Pendiente, Realizada, Cancelada), </w:t>
+      </w:r>
+      <w:proofErr w:type="spellStart"/>
+      <w:r>
+        <w:t>motivo_consulta</w:t>
+      </w:r>
+      <w:proofErr w:type="spellEnd"/>
+      <w:r>
+        <w:t>, diagnostico.</w:t>
+      </w:r>
+    </w:p>
+    <w:p>
+      <w:pPr>
+        <w:pStyle w:val="Prrafodelista"/>
+        <w:numPr>
+          <w:ilvl w:val="0"/>
+          <w:numId w:val="10"/>
+        </w:numPr>
+        <w:suppressAutoHyphens/>
+        <w:autoSpaceDN w:val="0"/>
+        <w:spacing w:before="0" w:after="160" w:line="278" w:lineRule="auto"/>
+        <w:jc w:val="left"/>
+        <w:textAlignment w:val="baseline"/>
+      </w:pPr>
+      <w:proofErr w:type="spellStart"/>
+      <w:r>
+        <w:rPr>
+          <w:b/>
+          <w:bCs/>
+        </w:rPr>
+        <w:t>Historial_</w:t>
+      </w:r>
+      <w:proofErr w:type="gramStart"/>
+      <w:r>
+        <w:rPr>
+          <w:b/>
+          <w:bCs/>
+        </w:rPr>
+        <w:t>Medico</w:t>
+      </w:r>
+      <w:proofErr w:type="spellEnd"/>
+      <w:r>
+        <w:t xml:space="preserve"> :</w:t>
+      </w:r>
+      <w:proofErr w:type="gramEnd"/>
+      <w:r>
+        <w:t xml:space="preserve"> </w:t>
+      </w:r>
+      <w:proofErr w:type="spellStart"/>
+      <w:r>
+        <w:t>id_historial</w:t>
+      </w:r>
+      <w:proofErr w:type="spellEnd"/>
+      <w:r>
+        <w:t xml:space="preserve"> (PK), </w:t>
+      </w:r>
+      <w:proofErr w:type="spellStart"/>
+      <w:r>
+        <w:t>id_paciente</w:t>
+      </w:r>
+      <w:proofErr w:type="spellEnd"/>
+      <w:r>
+        <w:t xml:space="preserve"> (FK), </w:t>
+      </w:r>
+      <w:proofErr w:type="spellStart"/>
+      <w:r>
+        <w:t>id_cita</w:t>
+      </w:r>
+      <w:proofErr w:type="spellEnd"/>
+      <w:r>
+        <w:t xml:space="preserve"> (FK), </w:t>
+      </w:r>
+      <w:proofErr w:type="spellStart"/>
+      <w:r>
+        <w:t>diagnostico</w:t>
+      </w:r>
+      <w:proofErr w:type="spellEnd"/>
+      <w:r>
+        <w:t xml:space="preserve">, tratamiento, </w:t>
+      </w:r>
+      <w:proofErr w:type="spellStart"/>
+      <w:r>
+        <w:t>fecha_registro</w:t>
+      </w:r>
+      <w:proofErr w:type="spellEnd"/>
+      <w:r>
+        <w:t>.</w:t>
+      </w:r>
+    </w:p>
+    <w:p>
+      <w:pPr>
+        <w:suppressAutoHyphens/>
+        <w:autoSpaceDN w:val="0"/>
+        <w:spacing w:before="0" w:after="160" w:line="278" w:lineRule="auto"/>
+        <w:jc w:val="left"/>
+        <w:textAlignment w:val="baseline"/>
+      </w:pPr>
+      <w:r>
+        <w:rPr>
+          <w:noProof/>
+        </w:rPr>
+        <w:drawing>
+          <wp:anchor distT="0" distB="0" distL="114300" distR="114300" simplePos="0" relativeHeight="251660288" behindDoc="1" locked="0" layoutInCell="1" allowOverlap="1" wp14:anchorId="1145F4E2" wp14:editId="1E77FD9F">
+            <wp:simplePos x="0" y="0"/>
+            <wp:positionH relativeFrom="column">
+              <wp:posOffset>546100</wp:posOffset>
+            </wp:positionH>
+            <wp:positionV relativeFrom="paragraph">
+              <wp:posOffset>3810</wp:posOffset>
+            </wp:positionV>
+            <wp:extent cx="4025900" cy="3073400"/>
+            <wp:effectExtent l="0" t="0" r="0" b="0"/>
+            <wp:wrapTight wrapText="bothSides">
+              <wp:wrapPolygon edited="0">
+                <wp:start x="0" y="0"/>
+                <wp:lineTo x="0" y="21421"/>
+                <wp:lineTo x="21464" y="21421"/>
+                <wp:lineTo x="21464" y="0"/>
+                <wp:lineTo x="0" y="0"/>
+              </wp:wrapPolygon>
+            </wp:wrapTight>
+            <wp:docPr id="1095214125" name="Imagen 1"/>
+            <wp:cNvGraphicFramePr>
+              <a:graphicFrameLocks xmlns:a="http://schemas.openxmlformats.org/drawingml/2006/main" noChangeAspect="1"/>
+            </wp:cNvGraphicFramePr>
+            <a:graphic xmlns:a="http://schemas.openxmlformats.org/drawingml/2006/main">
+              <a:graphicData uri="http://schemas.openxmlformats.org/drawingml/2006/picture">
+                <pic:pic xmlns:pic="http://schemas.openxmlformats.org/drawingml/2006/picture">
+                  <pic:nvPicPr>
+                    <pic:cNvPr id="0" name="Picture 1"/>
+                    <pic:cNvPicPr>
+                      <a:picLocks noChangeAspect="1" noChangeArrowheads="1"/>
+                    </pic:cNvPicPr>
+                  </pic:nvPicPr>
+                  <pic:blipFill>
+                    <a:blip r:embed="rId10">
+                      <a:extLst>
+                        <a:ext uri="{28A0092B-C50C-407E-A947-70E740481C1C}">
+                          <a14:useLocalDpi xmlns:a14="http://schemas.microsoft.com/office/drawing/2010/main" val="0"/>
+                        </a:ext>
+                      </a:extLst>
+                    </a:blip>
+                    <a:srcRect/>
+                    <a:stretch>
+                      <a:fillRect/>
+                    </a:stretch>
+                  </pic:blipFill>
+                  <pic:spPr bwMode="auto">
+                    <a:xfrm>
+                      <a:off x="0" y="0"/>
+                      <a:ext cx="4025900" cy="3073400"/>
+                    </a:xfrm>
+                    <a:prstGeom prst="rect">
+                      <a:avLst/>
+                    </a:prstGeom>
+                    <a:noFill/>
+                    <a:ln>
+                      <a:noFill/>
+                    </a:ln>
+                  </pic:spPr>
+                </pic:pic>
+              </a:graphicData>
+            </a:graphic>
+            <wp14:sizeRelH relativeFrom="margin">
+              <wp14:pctWidth>0</wp14:pctWidth>
+            </wp14:sizeRelH>
+            <wp14:sizeRelV relativeFrom="margin">
+              <wp14:pctHeight>0</wp14:pctHeight>
+            </wp14:sizeRelV>
+          </wp:anchor>
+        </w:drawing>
+      </w:r>
+    </w:p>
+    <w:p>
+      <w:pPr>
+        <w:pStyle w:val="Ttulo2"/>
+      </w:pPr>
+      <w:bookmarkStart w:id="16" w:name="_Toc241172017"/>
+    </w:p>
+    <w:p/>
+    <w:p/>
+    <w:p/>
+    <w:p/>
+    <w:p>
+      <w:pPr>
+        <w:pStyle w:val="Ttulo2"/>
+      </w:pPr>
+      <w:r>
+        <w:lastRenderedPageBreak/>
+        <w:t>diagramas de Casos de Uso</w:t>
+      </w:r>
+      <w:bookmarkEnd w:id="16"/>
+    </w:p>
+    <w:p/>
+    <w:p>
+      <w:pPr>
+        <w:pStyle w:val="Ttulo2"/>
+      </w:pPr>
+      <w:bookmarkStart w:id="17" w:name="_Toc241172018"/>
+      <w:r>
+        <w:t>diagrama de clases</w:t>
+      </w:r>
+      <w:bookmarkEnd w:id="17"/>
+    </w:p>
+    <w:p/>
     <w:p>
       <w:r>
         <w:br w:type="page"/>
@@ -2191,12 +4116,12 @@
           <w:numId w:val="1"/>
         </w:numPr>
       </w:pPr>
-      <w:bookmarkStart w:id="12" w:name="_Toc159224223"/>
+      <w:bookmarkStart w:id="18" w:name="_Toc241172035"/>
       <w:r>
         <w:lastRenderedPageBreak/>
         <w:t>Despliegue y pruebas</w:t>
       </w:r>
-      <w:bookmarkEnd w:id="12"/>
+      <w:bookmarkEnd w:id="18"/>
       <w:r>
         <w:t xml:space="preserve"> </w:t>
       </w:r>
@@ -2220,12 +4145,12 @@
           <w:numId w:val="1"/>
         </w:numPr>
       </w:pPr>
-      <w:bookmarkStart w:id="13" w:name="_Toc159224224"/>
+      <w:bookmarkStart w:id="19" w:name="_Toc241172036"/>
       <w:r>
         <w:lastRenderedPageBreak/>
         <w:t>Conclusiones</w:t>
       </w:r>
-      <w:bookmarkEnd w:id="13"/>
+      <w:bookmarkEnd w:id="19"/>
       <w:r>
         <w:t xml:space="preserve"> </w:t>
       </w:r>
@@ -2248,12 +4173,12 @@
           <w:numId w:val="1"/>
         </w:numPr>
       </w:pPr>
-      <w:bookmarkStart w:id="14" w:name="_Toc159224225"/>
+      <w:bookmarkStart w:id="20" w:name="_Toc241172037"/>
       <w:r>
         <w:lastRenderedPageBreak/>
         <w:t>Vías futuras</w:t>
       </w:r>
-      <w:bookmarkEnd w:id="14"/>
+      <w:bookmarkEnd w:id="20"/>
       <w:r>
         <w:t xml:space="preserve"> </w:t>
       </w:r>
@@ -2276,12 +4201,12 @@
           <w:numId w:val="1"/>
         </w:numPr>
       </w:pPr>
-      <w:bookmarkStart w:id="15" w:name="_Toc159224226"/>
+      <w:bookmarkStart w:id="21" w:name="_Toc241172038"/>
       <w:r>
         <w:lastRenderedPageBreak/>
         <w:t>Bibliografía/Webgrafía</w:t>
       </w:r>
-      <w:bookmarkEnd w:id="15"/>
+      <w:bookmarkEnd w:id="21"/>
       <w:r>
         <w:t xml:space="preserve"> </w:t>
       </w:r>
@@ -2304,12 +4229,12 @@
           <w:numId w:val="1"/>
         </w:numPr>
       </w:pPr>
-      <w:bookmarkStart w:id="16" w:name="_Toc159224227"/>
+      <w:bookmarkStart w:id="22" w:name="_Toc241172039"/>
       <w:r>
         <w:lastRenderedPageBreak/>
         <w:t>Anexos</w:t>
       </w:r>
-      <w:bookmarkEnd w:id="16"/>
+      <w:bookmarkEnd w:id="22"/>
     </w:p>
     <w:p>
       <w:pPr>
@@ -2319,11 +4244,11 @@
           <w:numId w:val="1"/>
         </w:numPr>
       </w:pPr>
-      <w:bookmarkStart w:id="17" w:name="_Toc159224228"/>
+      <w:bookmarkStart w:id="23" w:name="_Toc241172040"/>
       <w:r>
         <w:t>Manual de Instalación</w:t>
       </w:r>
-      <w:bookmarkEnd w:id="17"/>
+      <w:bookmarkEnd w:id="23"/>
     </w:p>
     <w:p/>
     <w:p>
@@ -2334,11 +4259,11 @@
           <w:numId w:val="1"/>
         </w:numPr>
       </w:pPr>
-      <w:bookmarkStart w:id="18" w:name="_Toc159224229"/>
+      <w:bookmarkStart w:id="24" w:name="_Toc241172041"/>
       <w:r>
         <w:t>Manual de Usuario</w:t>
       </w:r>
-      <w:bookmarkEnd w:id="18"/>
+      <w:bookmarkEnd w:id="24"/>
     </w:p>
     <w:p/>
     <w:p>
@@ -2364,12 +4289,12 @@
           <w:vertAlign w:val="subscript"/>
         </w:rPr>
       </w:pPr>
-      <w:bookmarkStart w:id="19" w:name="_heading=h.z337ya" w:colFirst="0" w:colLast="0"/>
-      <w:bookmarkEnd w:id="19"/>
-    </w:p>
-    <w:p>
-      <w:bookmarkStart w:id="20" w:name="_heading=h.3j2qqm3" w:colFirst="0" w:colLast="0"/>
-      <w:bookmarkEnd w:id="20"/>
+      <w:bookmarkStart w:id="25" w:name="_heading=h.z337ya" w:colFirst="0" w:colLast="0"/>
+      <w:bookmarkEnd w:id="25"/>
+    </w:p>
+    <w:p>
+      <w:bookmarkStart w:id="26" w:name="_heading=h.3j2qqm3" w:colFirst="0" w:colLast="0"/>
+      <w:bookmarkEnd w:id="26"/>
     </w:p>
     <w:p>
       <w:pPr>
@@ -2428,8 +4353,8 @@
       </w:r>
     </w:p>
     <w:sectPr>
-      <w:headerReference w:type="default" r:id="rId10"/>
-      <w:headerReference w:type="first" r:id="rId11"/>
+      <w:headerReference w:type="default" r:id="rId11"/>
+      <w:headerReference w:type="first" r:id="rId12"/>
       <w:pgSz w:w="11909" w:h="16834"/>
       <w:pgMar w:top="1440" w:right="1440" w:bottom="1440" w:left="1440" w:header="720" w:footer="0" w:gutter="0"/>
       <w:pgNumType w:start="1"/>
@@ -2608,6 +4533,321 @@
 <file path=word/numbering.xml><?xml version="1.0" encoding="utf-8"?>
 <w:numbering xmlns:wpc="http://schemas.microsoft.com/office/word/2010/wordprocessingCanvas" xmlns:cx="http://schemas.microsoft.com/office/drawing/2014/chartex" xmlns:cx1="http://schemas.microsoft.com/office/drawing/2015/9/8/chartex" xmlns:cx2="http://schemas.microsoft.com/office/drawing/2015/10/21/chartex" xmlns:cx3="http://schemas.microsoft.com/office/drawing/2016/5/9/chartex" xmlns:cx4="http://schemas.microsoft.com/office/drawing/2016/5/10/chartex" xmlns:cx5="http://schemas.microsoft.com/office/drawing/2016/5/11/chartex" xmlns:cx6="http://schemas.microsoft.com/office/drawing/2016/5/12/chartex" xmlns:cx7="http://schemas.microsoft.com/office/drawing/2016/5/13/chartex" xmlns:cx8="http://schemas.microsoft.com/office/drawing/2016/5/14/chartex" xmlns:mc="http://schemas.openxmlformats.org/markup-compatibility/2006" xmlns:aink="http://schemas.microsoft.com/office/drawing/2016/ink" xmlns:am3d="http://schemas.microsoft.com/office/drawing/2017/model3d" xmlns:o="urn:schemas-microsoft-com:office:office" xmlns:oel="http://schemas.microsoft.com/office/2019/extlst" xmlns:r="http://schemas.openxmlformats.org/officeDocument/2006/relationships" xmlns:m="http://schemas.openxmlformats.org/officeDocument/2006/math" xmlns:v="urn:schemas-microsoft-com:vml" xmlns:wp14="http://schemas.microsoft.com/office/word/2010/wordprocessingDrawing" xmlns:wp="http://schemas.openxmlformats.org/drawingml/2006/wordprocessingDrawing" xmlns:w10="urn:schemas-microsoft-com:office:word" xmlns:w="http://schemas.openxmlformats.org/wordprocessingml/2006/main" xmlns:w14="http://schemas.microsoft.com/office/word/2010/wordml" xmlns:w15="http://schemas.microsoft.com/office/word/2012/wordml" xmlns:w16cex="http://schemas.microsoft.com/office/word/2018/wordml/cex" xmlns:w16cid="http://schemas.microsoft.com/office/word/2016/wordml/cid" xmlns:w16="http://schemas.microsoft.com/office/word/2018/wordml" xmlns:w16du="http://schemas.microsoft.com/office/word/2023/wordml/word16du" xmlns:w16sdtdh="http://schemas.microsoft.com/office/word/2020/wordml/sdtdatahash" xmlns:w16sdtfl="http://schemas.microsoft.com/office/word/2024/wordml/sdtformatlock" xmlns:w16se="http://schemas.microsoft.com/office/word/2015/wordml/symex" xmlns:wpg="http://schemas.microsoft.com/office/word/2010/wordprocessingGroup" xmlns:wpi="http://schemas.microsoft.com/office/word/2010/wordprocessingInk" xmlns:wne="http://schemas.microsoft.com/office/word/2006/wordml" xmlns:wps="http://schemas.microsoft.com/office/word/2010/wordprocessingShape" mc:Ignorable="w14 w15 w16se w16cid w16 w16cex w16sdtdh w16sdtfl w16du wp14">
   <w:abstractNum w:abstractNumId="0" w15:restartNumberingAfterBreak="0">
+    <w:nsid w:val="0B8E0180"/>
+    <w:multiLevelType w:val="hybridMultilevel"/>
+    <w:tmpl w:val="6B3AEBDC"/>
+    <w:lvl w:ilvl="0" w:tplc="0C0A0001">
+      <w:start w:val="1"/>
+      <w:numFmt w:val="bullet"/>
+      <w:lvlText w:val=""/>
+      <w:lvlJc w:val="left"/>
+      <w:pPr>
+        <w:ind w:left="720" w:hanging="360"/>
+      </w:pPr>
+      <w:rPr>
+        <w:rFonts w:ascii="Symbol" w:hAnsi="Symbol" w:hint="default"/>
+      </w:rPr>
+    </w:lvl>
+    <w:lvl w:ilvl="1" w:tplc="0C0A0003">
+      <w:start w:val="1"/>
+      <w:numFmt w:val="bullet"/>
+      <w:lvlText w:val="o"/>
+      <w:lvlJc w:val="left"/>
+      <w:pPr>
+        <w:ind w:left="1440" w:hanging="360"/>
+      </w:pPr>
+      <w:rPr>
+        <w:rFonts w:ascii="Courier New" w:hAnsi="Courier New" w:cs="Courier New" w:hint="default"/>
+      </w:rPr>
+    </w:lvl>
+    <w:lvl w:ilvl="2" w:tplc="0C0A0005" w:tentative="1">
+      <w:start w:val="1"/>
+      <w:numFmt w:val="bullet"/>
+      <w:lvlText w:val=""/>
+      <w:lvlJc w:val="left"/>
+      <w:pPr>
+        <w:ind w:left="2160" w:hanging="360"/>
+      </w:pPr>
+      <w:rPr>
+        <w:rFonts w:ascii="Wingdings" w:hAnsi="Wingdings" w:hint="default"/>
+      </w:rPr>
+    </w:lvl>
+    <w:lvl w:ilvl="3" w:tplc="0C0A0001" w:tentative="1">
+      <w:start w:val="1"/>
+      <w:numFmt w:val="bullet"/>
+      <w:lvlText w:val=""/>
+      <w:lvlJc w:val="left"/>
+      <w:pPr>
+        <w:ind w:left="2880" w:hanging="360"/>
+      </w:pPr>
+      <w:rPr>
+        <w:rFonts w:ascii="Symbol" w:hAnsi="Symbol" w:hint="default"/>
+      </w:rPr>
+    </w:lvl>
+    <w:lvl w:ilvl="4" w:tplc="0C0A0003" w:tentative="1">
+      <w:start w:val="1"/>
+      <w:numFmt w:val="bullet"/>
+      <w:lvlText w:val="o"/>
+      <w:lvlJc w:val="left"/>
+      <w:pPr>
+        <w:ind w:left="3600" w:hanging="360"/>
+      </w:pPr>
+      <w:rPr>
+        <w:rFonts w:ascii="Courier New" w:hAnsi="Courier New" w:cs="Courier New" w:hint="default"/>
+      </w:rPr>
+    </w:lvl>
+    <w:lvl w:ilvl="5" w:tplc="0C0A0005" w:tentative="1">
+      <w:start w:val="1"/>
+      <w:numFmt w:val="bullet"/>
+      <w:lvlText w:val=""/>
+      <w:lvlJc w:val="left"/>
+      <w:pPr>
+        <w:ind w:left="4320" w:hanging="360"/>
+      </w:pPr>
+      <w:rPr>
+        <w:rFonts w:ascii="Wingdings" w:hAnsi="Wingdings" w:hint="default"/>
+      </w:rPr>
+    </w:lvl>
+    <w:lvl w:ilvl="6" w:tplc="0C0A0001" w:tentative="1">
+      <w:start w:val="1"/>
+      <w:numFmt w:val="bullet"/>
+      <w:lvlText w:val=""/>
+      <w:lvlJc w:val="left"/>
+      <w:pPr>
+        <w:ind w:left="5040" w:hanging="360"/>
+      </w:pPr>
+      <w:rPr>
+        <w:rFonts w:ascii="Symbol" w:hAnsi="Symbol" w:hint="default"/>
+      </w:rPr>
+    </w:lvl>
+    <w:lvl w:ilvl="7" w:tplc="0C0A0003" w:tentative="1">
+      <w:start w:val="1"/>
+      <w:numFmt w:val="bullet"/>
+      <w:lvlText w:val="o"/>
+      <w:lvlJc w:val="left"/>
+      <w:pPr>
+        <w:ind w:left="5760" w:hanging="360"/>
+      </w:pPr>
+      <w:rPr>
+        <w:rFonts w:ascii="Courier New" w:hAnsi="Courier New" w:cs="Courier New" w:hint="default"/>
+      </w:rPr>
+    </w:lvl>
+    <w:lvl w:ilvl="8" w:tplc="0C0A0005" w:tentative="1">
+      <w:start w:val="1"/>
+      <w:numFmt w:val="bullet"/>
+      <w:lvlText w:val=""/>
+      <w:lvlJc w:val="left"/>
+      <w:pPr>
+        <w:ind w:left="6480" w:hanging="360"/>
+      </w:pPr>
+      <w:rPr>
+        <w:rFonts w:ascii="Wingdings" w:hAnsi="Wingdings" w:hint="default"/>
+      </w:rPr>
+    </w:lvl>
+  </w:abstractNum>
+  <w:abstractNum w:abstractNumId="1" w15:restartNumberingAfterBreak="0">
+    <w:nsid w:val="13A67678"/>
+    <w:multiLevelType w:val="hybridMultilevel"/>
+    <w:tmpl w:val="64DA93DC"/>
+    <w:lvl w:ilvl="0" w:tplc="0C0A0001">
+      <w:start w:val="1"/>
+      <w:numFmt w:val="bullet"/>
+      <w:lvlText w:val=""/>
+      <w:lvlJc w:val="left"/>
+      <w:pPr>
+        <w:ind w:left="720" w:hanging="360"/>
+      </w:pPr>
+      <w:rPr>
+        <w:rFonts w:ascii="Symbol" w:hAnsi="Symbol" w:hint="default"/>
+      </w:rPr>
+    </w:lvl>
+    <w:lvl w:ilvl="1" w:tplc="FFFFFFFF" w:tentative="1">
+      <w:start w:val="1"/>
+      <w:numFmt w:val="lowerLetter"/>
+      <w:lvlText w:val="%2."/>
+      <w:lvlJc w:val="left"/>
+      <w:pPr>
+        <w:ind w:left="1440" w:hanging="360"/>
+      </w:pPr>
+    </w:lvl>
+    <w:lvl w:ilvl="2" w:tplc="FFFFFFFF" w:tentative="1">
+      <w:start w:val="1"/>
+      <w:numFmt w:val="lowerRoman"/>
+      <w:lvlText w:val="%3."/>
+      <w:lvlJc w:val="right"/>
+      <w:pPr>
+        <w:ind w:left="2160" w:hanging="180"/>
+      </w:pPr>
+    </w:lvl>
+    <w:lvl w:ilvl="3" w:tplc="FFFFFFFF" w:tentative="1">
+      <w:start w:val="1"/>
+      <w:numFmt w:val="decimal"/>
+      <w:lvlText w:val="%4."/>
+      <w:lvlJc w:val="left"/>
+      <w:pPr>
+        <w:ind w:left="2880" w:hanging="360"/>
+      </w:pPr>
+    </w:lvl>
+    <w:lvl w:ilvl="4" w:tplc="FFFFFFFF" w:tentative="1">
+      <w:start w:val="1"/>
+      <w:numFmt w:val="lowerLetter"/>
+      <w:lvlText w:val="%5."/>
+      <w:lvlJc w:val="left"/>
+      <w:pPr>
+        <w:ind w:left="3600" w:hanging="360"/>
+      </w:pPr>
+    </w:lvl>
+    <w:lvl w:ilvl="5" w:tplc="FFFFFFFF" w:tentative="1">
+      <w:start w:val="1"/>
+      <w:numFmt w:val="lowerRoman"/>
+      <w:lvlText w:val="%6."/>
+      <w:lvlJc w:val="right"/>
+      <w:pPr>
+        <w:ind w:left="4320" w:hanging="180"/>
+      </w:pPr>
+    </w:lvl>
+    <w:lvl w:ilvl="6" w:tplc="FFFFFFFF" w:tentative="1">
+      <w:start w:val="1"/>
+      <w:numFmt w:val="decimal"/>
+      <w:lvlText w:val="%7."/>
+      <w:lvlJc w:val="left"/>
+      <w:pPr>
+        <w:ind w:left="5040" w:hanging="360"/>
+      </w:pPr>
+    </w:lvl>
+    <w:lvl w:ilvl="7" w:tplc="FFFFFFFF" w:tentative="1">
+      <w:start w:val="1"/>
+      <w:numFmt w:val="lowerLetter"/>
+      <w:lvlText w:val="%8."/>
+      <w:lvlJc w:val="left"/>
+      <w:pPr>
+        <w:ind w:left="5760" w:hanging="360"/>
+      </w:pPr>
+    </w:lvl>
+    <w:lvl w:ilvl="8" w:tplc="FFFFFFFF" w:tentative="1">
+      <w:start w:val="1"/>
+      <w:numFmt w:val="lowerRoman"/>
+      <w:lvlText w:val="%9."/>
+      <w:lvlJc w:val="right"/>
+      <w:pPr>
+        <w:ind w:left="6480" w:hanging="180"/>
+      </w:pPr>
+    </w:lvl>
+  </w:abstractNum>
+  <w:abstractNum w:abstractNumId="2" w15:restartNumberingAfterBreak="0">
+    <w:nsid w:val="1E497B12"/>
+    <w:multiLevelType w:val="hybridMultilevel"/>
+    <w:tmpl w:val="5F4C6ECC"/>
+    <w:lvl w:ilvl="0" w:tplc="0C0A0001">
+      <w:start w:val="1"/>
+      <w:numFmt w:val="bullet"/>
+      <w:lvlText w:val=""/>
+      <w:lvlJc w:val="left"/>
+      <w:pPr>
+        <w:ind w:left="720" w:hanging="360"/>
+      </w:pPr>
+      <w:rPr>
+        <w:rFonts w:ascii="Symbol" w:hAnsi="Symbol" w:hint="default"/>
+      </w:rPr>
+    </w:lvl>
+    <w:lvl w:ilvl="1" w:tplc="0C0A0003" w:tentative="1">
+      <w:start w:val="1"/>
+      <w:numFmt w:val="bullet"/>
+      <w:lvlText w:val="o"/>
+      <w:lvlJc w:val="left"/>
+      <w:pPr>
+        <w:ind w:left="1440" w:hanging="360"/>
+      </w:pPr>
+      <w:rPr>
+        <w:rFonts w:ascii="Courier New" w:hAnsi="Courier New" w:cs="Courier New" w:hint="default"/>
+      </w:rPr>
+    </w:lvl>
+    <w:lvl w:ilvl="2" w:tplc="0C0A0005" w:tentative="1">
+      <w:start w:val="1"/>
+      <w:numFmt w:val="bullet"/>
+      <w:lvlText w:val=""/>
+      <w:lvlJc w:val="left"/>
+      <w:pPr>
+        <w:ind w:left="2160" w:hanging="360"/>
+      </w:pPr>
+      <w:rPr>
+        <w:rFonts w:ascii="Wingdings" w:hAnsi="Wingdings" w:hint="default"/>
+      </w:rPr>
+    </w:lvl>
+    <w:lvl w:ilvl="3" w:tplc="0C0A0001" w:tentative="1">
+      <w:start w:val="1"/>
+      <w:numFmt w:val="bullet"/>
+      <w:lvlText w:val=""/>
+      <w:lvlJc w:val="left"/>
+      <w:pPr>
+        <w:ind w:left="2880" w:hanging="360"/>
+      </w:pPr>
+      <w:rPr>
+        <w:rFonts w:ascii="Symbol" w:hAnsi="Symbol" w:hint="default"/>
+      </w:rPr>
+    </w:lvl>
+    <w:lvl w:ilvl="4" w:tplc="0C0A0003" w:tentative="1">
+      <w:start w:val="1"/>
+      <w:numFmt w:val="bullet"/>
+      <w:lvlText w:val="o"/>
+      <w:lvlJc w:val="left"/>
+      <w:pPr>
+        <w:ind w:left="3600" w:hanging="360"/>
+      </w:pPr>
+      <w:rPr>
+        <w:rFonts w:ascii="Courier New" w:hAnsi="Courier New" w:cs="Courier New" w:hint="default"/>
+      </w:rPr>
+    </w:lvl>
+    <w:lvl w:ilvl="5" w:tplc="0C0A0005" w:tentative="1">
+      <w:start w:val="1"/>
+      <w:numFmt w:val="bullet"/>
+      <w:lvlText w:val=""/>
+      <w:lvlJc w:val="left"/>
+      <w:pPr>
+        <w:ind w:left="4320" w:hanging="360"/>
+      </w:pPr>
+      <w:rPr>
+        <w:rFonts w:ascii="Wingdings" w:hAnsi="Wingdings" w:hint="default"/>
+      </w:rPr>
+    </w:lvl>
+    <w:lvl w:ilvl="6" w:tplc="0C0A0001" w:tentative="1">
+      <w:start w:val="1"/>
+      <w:numFmt w:val="bullet"/>
+      <w:lvlText w:val=""/>
+      <w:lvlJc w:val="left"/>
+      <w:pPr>
+        <w:ind w:left="5040" w:hanging="360"/>
+      </w:pPr>
+      <w:rPr>
+        <w:rFonts w:ascii="Symbol" w:hAnsi="Symbol" w:hint="default"/>
+      </w:rPr>
+    </w:lvl>
+    <w:lvl w:ilvl="7" w:tplc="0C0A0003" w:tentative="1">
+      <w:start w:val="1"/>
+      <w:numFmt w:val="bullet"/>
+      <w:lvlText w:val="o"/>
+      <w:lvlJc w:val="left"/>
+      <w:pPr>
+        <w:ind w:left="5760" w:hanging="360"/>
+      </w:pPr>
+      <w:rPr>
+        <w:rFonts w:ascii="Courier New" w:hAnsi="Courier New" w:cs="Courier New" w:hint="default"/>
+      </w:rPr>
+    </w:lvl>
+    <w:lvl w:ilvl="8" w:tplc="0C0A0005" w:tentative="1">
+      <w:start w:val="1"/>
+      <w:numFmt w:val="bullet"/>
+      <w:lvlText w:val=""/>
+      <w:lvlJc w:val="left"/>
+      <w:pPr>
+        <w:ind w:left="6480" w:hanging="360"/>
+      </w:pPr>
+      <w:rPr>
+        <w:rFonts w:ascii="Wingdings" w:hAnsi="Wingdings" w:hint="default"/>
+      </w:rPr>
+    </w:lvl>
+  </w:abstractNum>
+  <w:abstractNum w:abstractNumId="3" w15:restartNumberingAfterBreak="0">
     <w:nsid w:val="1EBC368F"/>
     <w:multiLevelType w:val="multilevel"/>
     <w:tmpl w:val="72DE3258"/>
@@ -2693,7 +4933,405 @@
       </w:pPr>
     </w:lvl>
   </w:abstractNum>
-  <w:abstractNum w:abstractNumId="1" w15:restartNumberingAfterBreak="0">
+  <w:abstractNum w:abstractNumId="4" w15:restartNumberingAfterBreak="0">
+    <w:nsid w:val="25A868CF"/>
+    <w:multiLevelType w:val="hybridMultilevel"/>
+    <w:tmpl w:val="1F3EFD98"/>
+    <w:lvl w:ilvl="0" w:tplc="0C0A000F">
+      <w:start w:val="1"/>
+      <w:numFmt w:val="decimal"/>
+      <w:lvlText w:val="%1."/>
+      <w:lvlJc w:val="left"/>
+      <w:pPr>
+        <w:ind w:left="720" w:hanging="360"/>
+      </w:pPr>
+    </w:lvl>
+    <w:lvl w:ilvl="1" w:tplc="0C0A0019" w:tentative="1">
+      <w:start w:val="1"/>
+      <w:numFmt w:val="lowerLetter"/>
+      <w:lvlText w:val="%2."/>
+      <w:lvlJc w:val="left"/>
+      <w:pPr>
+        <w:ind w:left="1440" w:hanging="360"/>
+      </w:pPr>
+    </w:lvl>
+    <w:lvl w:ilvl="2" w:tplc="0C0A001B" w:tentative="1">
+      <w:start w:val="1"/>
+      <w:numFmt w:val="lowerRoman"/>
+      <w:lvlText w:val="%3."/>
+      <w:lvlJc w:val="right"/>
+      <w:pPr>
+        <w:ind w:left="2160" w:hanging="180"/>
+      </w:pPr>
+    </w:lvl>
+    <w:lvl w:ilvl="3" w:tplc="0C0A000F" w:tentative="1">
+      <w:start w:val="1"/>
+      <w:numFmt w:val="decimal"/>
+      <w:lvlText w:val="%4."/>
+      <w:lvlJc w:val="left"/>
+      <w:pPr>
+        <w:ind w:left="2880" w:hanging="360"/>
+      </w:pPr>
+    </w:lvl>
+    <w:lvl w:ilvl="4" w:tplc="0C0A0019" w:tentative="1">
+      <w:start w:val="1"/>
+      <w:numFmt w:val="lowerLetter"/>
+      <w:lvlText w:val="%5."/>
+      <w:lvlJc w:val="left"/>
+      <w:pPr>
+        <w:ind w:left="3600" w:hanging="360"/>
+      </w:pPr>
+    </w:lvl>
+    <w:lvl w:ilvl="5" w:tplc="0C0A001B" w:tentative="1">
+      <w:start w:val="1"/>
+      <w:numFmt w:val="lowerRoman"/>
+      <w:lvlText w:val="%6."/>
+      <w:lvlJc w:val="right"/>
+      <w:pPr>
+        <w:ind w:left="4320" w:hanging="180"/>
+      </w:pPr>
+    </w:lvl>
+    <w:lvl w:ilvl="6" w:tplc="0C0A000F" w:tentative="1">
+      <w:start w:val="1"/>
+      <w:numFmt w:val="decimal"/>
+      <w:lvlText w:val="%7."/>
+      <w:lvlJc w:val="left"/>
+      <w:pPr>
+        <w:ind w:left="5040" w:hanging="360"/>
+      </w:pPr>
+    </w:lvl>
+    <w:lvl w:ilvl="7" w:tplc="0C0A0019" w:tentative="1">
+      <w:start w:val="1"/>
+      <w:numFmt w:val="lowerLetter"/>
+      <w:lvlText w:val="%8."/>
+      <w:lvlJc w:val="left"/>
+      <w:pPr>
+        <w:ind w:left="5760" w:hanging="360"/>
+      </w:pPr>
+    </w:lvl>
+    <w:lvl w:ilvl="8" w:tplc="0C0A001B" w:tentative="1">
+      <w:start w:val="1"/>
+      <w:numFmt w:val="lowerRoman"/>
+      <w:lvlText w:val="%9."/>
+      <w:lvlJc w:val="right"/>
+      <w:pPr>
+        <w:ind w:left="6480" w:hanging="180"/>
+      </w:pPr>
+    </w:lvl>
+  </w:abstractNum>
+  <w:abstractNum w:abstractNumId="5" w15:restartNumberingAfterBreak="0">
+    <w:nsid w:val="315F43C4"/>
+    <w:multiLevelType w:val="multilevel"/>
+    <w:tmpl w:val="40069E20"/>
+    <w:lvl w:ilvl="0">
+      <w:start w:val="1"/>
+      <w:numFmt w:val="decimal"/>
+      <w:lvlText w:val="%1."/>
+      <w:lvlJc w:val="left"/>
+      <w:pPr>
+        <w:ind w:left="384" w:hanging="384"/>
+      </w:pPr>
+      <w:rPr>
+        <w:rFonts w:hint="default"/>
+      </w:rPr>
+    </w:lvl>
+    <w:lvl w:ilvl="1">
+      <w:start w:val="4"/>
+      <w:numFmt w:val="decimal"/>
+      <w:lvlText w:val="(%1-%2"/>
+      <w:lvlJc w:val="left"/>
+      <w:pPr>
+        <w:ind w:left="720" w:hanging="720"/>
+      </w:pPr>
+      <w:rPr>
+        <w:rFonts w:hint="default"/>
+      </w:rPr>
+    </w:lvl>
+    <w:lvl w:ilvl="2">
+      <w:start w:val="1"/>
+      <w:numFmt w:val="decimal"/>
+      <w:lvlText w:val="(%1-%2.%3"/>
+      <w:lvlJc w:val="left"/>
+      <w:pPr>
+        <w:ind w:left="1080" w:hanging="1080"/>
+      </w:pPr>
+      <w:rPr>
+        <w:rFonts w:hint="default"/>
+      </w:rPr>
+    </w:lvl>
+    <w:lvl w:ilvl="3">
+      <w:start w:val="1"/>
+      <w:numFmt w:val="decimal"/>
+      <w:lvlText w:val="(%1-%2.%3.%4"/>
+      <w:lvlJc w:val="left"/>
+      <w:pPr>
+        <w:ind w:left="1080" w:hanging="1080"/>
+      </w:pPr>
+      <w:rPr>
+        <w:rFonts w:hint="default"/>
+      </w:rPr>
+    </w:lvl>
+    <w:lvl w:ilvl="4">
+      <w:start w:val="1"/>
+      <w:numFmt w:val="decimal"/>
+      <w:lvlText w:val="(%1-%2.%3.%4.%5"/>
+      <w:lvlJc w:val="left"/>
+      <w:pPr>
+        <w:ind w:left="1440" w:hanging="1440"/>
+      </w:pPr>
+      <w:rPr>
+        <w:rFonts w:hint="default"/>
+      </w:rPr>
+    </w:lvl>
+    <w:lvl w:ilvl="5">
+      <w:start w:val="1"/>
+      <w:numFmt w:val="decimal"/>
+      <w:lvlText w:val="(%1-%2.%3.%4.%5.%6"/>
+      <w:lvlJc w:val="left"/>
+      <w:pPr>
+        <w:ind w:left="1440" w:hanging="1440"/>
+      </w:pPr>
+      <w:rPr>
+        <w:rFonts w:hint="default"/>
+      </w:rPr>
+    </w:lvl>
+    <w:lvl w:ilvl="6">
+      <w:start w:val="1"/>
+      <w:numFmt w:val="decimal"/>
+      <w:lvlText w:val="(%1-%2.%3.%4.%5.%6.%7"/>
+      <w:lvlJc w:val="left"/>
+      <w:pPr>
+        <w:ind w:left="1800" w:hanging="1800"/>
+      </w:pPr>
+      <w:rPr>
+        <w:rFonts w:hint="default"/>
+      </w:rPr>
+    </w:lvl>
+    <w:lvl w:ilvl="7">
+      <w:start w:val="1"/>
+      <w:numFmt w:val="decimal"/>
+      <w:lvlText w:val="(%1-%2.%3.%4.%5.%6.%7.%8"/>
+      <w:lvlJc w:val="left"/>
+      <w:pPr>
+        <w:ind w:left="2160" w:hanging="2160"/>
+      </w:pPr>
+      <w:rPr>
+        <w:rFonts w:hint="default"/>
+      </w:rPr>
+    </w:lvl>
+    <w:lvl w:ilvl="8">
+      <w:start w:val="1"/>
+      <w:numFmt w:val="decimal"/>
+      <w:lvlText w:val="(%1-%2.%3.%4.%5.%6.%7.%8.%9"/>
+      <w:lvlJc w:val="left"/>
+      <w:pPr>
+        <w:ind w:left="2160" w:hanging="2160"/>
+      </w:pPr>
+      <w:rPr>
+        <w:rFonts w:hint="default"/>
+      </w:rPr>
+    </w:lvl>
+  </w:abstractNum>
+  <w:abstractNum w:abstractNumId="6" w15:restartNumberingAfterBreak="0">
+    <w:nsid w:val="3B49303B"/>
+    <w:multiLevelType w:val="hybridMultilevel"/>
+    <w:tmpl w:val="EABE4226"/>
+    <w:lvl w:ilvl="0" w:tplc="0C0A0001">
+      <w:start w:val="1"/>
+      <w:numFmt w:val="bullet"/>
+      <w:lvlText w:val=""/>
+      <w:lvlJc w:val="left"/>
+      <w:pPr>
+        <w:ind w:left="720" w:hanging="360"/>
+      </w:pPr>
+      <w:rPr>
+        <w:rFonts w:ascii="Symbol" w:hAnsi="Symbol" w:hint="default"/>
+      </w:rPr>
+    </w:lvl>
+    <w:lvl w:ilvl="1" w:tplc="0C0A0003">
+      <w:start w:val="1"/>
+      <w:numFmt w:val="bullet"/>
+      <w:lvlText w:val="o"/>
+      <w:lvlJc w:val="left"/>
+      <w:pPr>
+        <w:ind w:left="1440" w:hanging="360"/>
+      </w:pPr>
+      <w:rPr>
+        <w:rFonts w:ascii="Courier New" w:hAnsi="Courier New" w:cs="Courier New" w:hint="default"/>
+      </w:rPr>
+    </w:lvl>
+    <w:lvl w:ilvl="2" w:tplc="0C0A0005" w:tentative="1">
+      <w:start w:val="1"/>
+      <w:numFmt w:val="bullet"/>
+      <w:lvlText w:val=""/>
+      <w:lvlJc w:val="left"/>
+      <w:pPr>
+        <w:ind w:left="2160" w:hanging="360"/>
+      </w:pPr>
+      <w:rPr>
+        <w:rFonts w:ascii="Wingdings" w:hAnsi="Wingdings" w:hint="default"/>
+      </w:rPr>
+    </w:lvl>
+    <w:lvl w:ilvl="3" w:tplc="0C0A0001" w:tentative="1">
+      <w:start w:val="1"/>
+      <w:numFmt w:val="bullet"/>
+      <w:lvlText w:val=""/>
+      <w:lvlJc w:val="left"/>
+      <w:pPr>
+        <w:ind w:left="2880" w:hanging="360"/>
+      </w:pPr>
+      <w:rPr>
+        <w:rFonts w:ascii="Symbol" w:hAnsi="Symbol" w:hint="default"/>
+      </w:rPr>
+    </w:lvl>
+    <w:lvl w:ilvl="4" w:tplc="0C0A0003" w:tentative="1">
+      <w:start w:val="1"/>
+      <w:numFmt w:val="bullet"/>
+      <w:lvlText w:val="o"/>
+      <w:lvlJc w:val="left"/>
+      <w:pPr>
+        <w:ind w:left="3600" w:hanging="360"/>
+      </w:pPr>
+      <w:rPr>
+        <w:rFonts w:ascii="Courier New" w:hAnsi="Courier New" w:cs="Courier New" w:hint="default"/>
+      </w:rPr>
+    </w:lvl>
+    <w:lvl w:ilvl="5" w:tplc="0C0A0005" w:tentative="1">
+      <w:start w:val="1"/>
+      <w:numFmt w:val="bullet"/>
+      <w:lvlText w:val=""/>
+      <w:lvlJc w:val="left"/>
+      <w:pPr>
+        <w:ind w:left="4320" w:hanging="360"/>
+      </w:pPr>
+      <w:rPr>
+        <w:rFonts w:ascii="Wingdings" w:hAnsi="Wingdings" w:hint="default"/>
+      </w:rPr>
+    </w:lvl>
+    <w:lvl w:ilvl="6" w:tplc="0C0A0001" w:tentative="1">
+      <w:start w:val="1"/>
+      <w:numFmt w:val="bullet"/>
+      <w:lvlText w:val=""/>
+      <w:lvlJc w:val="left"/>
+      <w:pPr>
+        <w:ind w:left="5040" w:hanging="360"/>
+      </w:pPr>
+      <w:rPr>
+        <w:rFonts w:ascii="Symbol" w:hAnsi="Symbol" w:hint="default"/>
+      </w:rPr>
+    </w:lvl>
+    <w:lvl w:ilvl="7" w:tplc="0C0A0003" w:tentative="1">
+      <w:start w:val="1"/>
+      <w:numFmt w:val="bullet"/>
+      <w:lvlText w:val="o"/>
+      <w:lvlJc w:val="left"/>
+      <w:pPr>
+        <w:ind w:left="5760" w:hanging="360"/>
+      </w:pPr>
+      <w:rPr>
+        <w:rFonts w:ascii="Courier New" w:hAnsi="Courier New" w:cs="Courier New" w:hint="default"/>
+      </w:rPr>
+    </w:lvl>
+    <w:lvl w:ilvl="8" w:tplc="0C0A0005" w:tentative="1">
+      <w:start w:val="1"/>
+      <w:numFmt w:val="bullet"/>
+      <w:lvlText w:val=""/>
+      <w:lvlJc w:val="left"/>
+      <w:pPr>
+        <w:ind w:left="6480" w:hanging="360"/>
+      </w:pPr>
+      <w:rPr>
+        <w:rFonts w:ascii="Wingdings" w:hAnsi="Wingdings" w:hint="default"/>
+      </w:rPr>
+    </w:lvl>
+  </w:abstractNum>
+  <w:abstractNum w:abstractNumId="7" w15:restartNumberingAfterBreak="0">
+    <w:nsid w:val="505937FD"/>
+    <w:multiLevelType w:val="hybridMultilevel"/>
+    <w:tmpl w:val="41E8B920"/>
+    <w:lvl w:ilvl="0" w:tplc="0C0A0011">
+      <w:start w:val="1"/>
+      <w:numFmt w:val="decimal"/>
+      <w:lvlText w:val="%1)"/>
+      <w:lvlJc w:val="left"/>
+      <w:pPr>
+        <w:ind w:left="720" w:hanging="360"/>
+      </w:pPr>
+    </w:lvl>
+    <w:lvl w:ilvl="1" w:tplc="0C0A0019" w:tentative="1">
+      <w:start w:val="1"/>
+      <w:numFmt w:val="lowerLetter"/>
+      <w:lvlText w:val="%2."/>
+      <w:lvlJc w:val="left"/>
+      <w:pPr>
+        <w:ind w:left="1440" w:hanging="360"/>
+      </w:pPr>
+    </w:lvl>
+    <w:lvl w:ilvl="2" w:tplc="0C0A001B" w:tentative="1">
+      <w:start w:val="1"/>
+      <w:numFmt w:val="lowerRoman"/>
+      <w:lvlText w:val="%3."/>
+      <w:lvlJc w:val="right"/>
+      <w:pPr>
+        <w:ind w:left="2160" w:hanging="180"/>
+      </w:pPr>
+    </w:lvl>
+    <w:lvl w:ilvl="3" w:tplc="0C0A000F" w:tentative="1">
+      <w:start w:val="1"/>
+      <w:numFmt w:val="decimal"/>
+      <w:lvlText w:val="%4."/>
+      <w:lvlJc w:val="left"/>
+      <w:pPr>
+        <w:ind w:left="2880" w:hanging="360"/>
+      </w:pPr>
+    </w:lvl>
+    <w:lvl w:ilvl="4" w:tplc="0C0A0019" w:tentative="1">
+      <w:start w:val="1"/>
+      <w:numFmt w:val="lowerLetter"/>
+      <w:lvlText w:val="%5."/>
+      <w:lvlJc w:val="left"/>
+      <w:pPr>
+        <w:ind w:left="3600" w:hanging="360"/>
+      </w:pPr>
+    </w:lvl>
+    <w:lvl w:ilvl="5" w:tplc="0C0A001B" w:tentative="1">
+      <w:start w:val="1"/>
+      <w:numFmt w:val="lowerRoman"/>
+      <w:lvlText w:val="%6."/>
+      <w:lvlJc w:val="right"/>
+      <w:pPr>
+        <w:ind w:left="4320" w:hanging="180"/>
+      </w:pPr>
+    </w:lvl>
+    <w:lvl w:ilvl="6" w:tplc="0C0A000F" w:tentative="1">
+      <w:start w:val="1"/>
+      <w:numFmt w:val="decimal"/>
+      <w:lvlText w:val="%7."/>
+      <w:lvlJc w:val="left"/>
+      <w:pPr>
+        <w:ind w:left="5040" w:hanging="360"/>
+      </w:pPr>
+    </w:lvl>
+    <w:lvl w:ilvl="7" w:tplc="0C0A0019" w:tentative="1">
+      <w:start w:val="1"/>
+      <w:numFmt w:val="lowerLetter"/>
+      <w:lvlText w:val="%8."/>
+      <w:lvlJc w:val="left"/>
+      <w:pPr>
+        <w:ind w:left="5760" w:hanging="360"/>
+      </w:pPr>
+    </w:lvl>
+    <w:lvl w:ilvl="8" w:tplc="0C0A001B" w:tentative="1">
+      <w:start w:val="1"/>
+      <w:numFmt w:val="lowerRoman"/>
+      <w:lvlText w:val="%9."/>
+      <w:lvlJc w:val="right"/>
+      <w:pPr>
+        <w:ind w:left="6480" w:hanging="180"/>
+      </w:pPr>
+    </w:lvl>
+  </w:abstractNum>
+  <w:abstractNum w:abstractNumId="8" w15:restartNumberingAfterBreak="0">
     <w:nsid w:val="51555E00"/>
     <w:multiLevelType w:val="multilevel"/>
     <w:tmpl w:val="D41E289C"/>
@@ -2779,11 +5417,264 @@
       </w:pPr>
     </w:lvl>
   </w:abstractNum>
+  <w:abstractNum w:abstractNumId="9" w15:restartNumberingAfterBreak="0">
+    <w:nsid w:val="54C37510"/>
+    <w:multiLevelType w:val="hybridMultilevel"/>
+    <w:tmpl w:val="6142A5C4"/>
+    <w:lvl w:ilvl="0" w:tplc="0C0A0001">
+      <w:start w:val="1"/>
+      <w:numFmt w:val="bullet"/>
+      <w:lvlText w:val=""/>
+      <w:lvlJc w:val="left"/>
+      <w:pPr>
+        <w:ind w:left="720" w:hanging="360"/>
+      </w:pPr>
+      <w:rPr>
+        <w:rFonts w:ascii="Symbol" w:hAnsi="Symbol" w:hint="default"/>
+      </w:rPr>
+    </w:lvl>
+    <w:lvl w:ilvl="1" w:tplc="0C0A0003" w:tentative="1">
+      <w:start w:val="1"/>
+      <w:numFmt w:val="bullet"/>
+      <w:lvlText w:val="o"/>
+      <w:lvlJc w:val="left"/>
+      <w:pPr>
+        <w:ind w:left="1440" w:hanging="360"/>
+      </w:pPr>
+      <w:rPr>
+        <w:rFonts w:ascii="Courier New" w:hAnsi="Courier New" w:cs="Courier New" w:hint="default"/>
+      </w:rPr>
+    </w:lvl>
+    <w:lvl w:ilvl="2" w:tplc="0C0A0005" w:tentative="1">
+      <w:start w:val="1"/>
+      <w:numFmt w:val="bullet"/>
+      <w:lvlText w:val=""/>
+      <w:lvlJc w:val="left"/>
+      <w:pPr>
+        <w:ind w:left="2160" w:hanging="360"/>
+      </w:pPr>
+      <w:rPr>
+        <w:rFonts w:ascii="Wingdings" w:hAnsi="Wingdings" w:hint="default"/>
+      </w:rPr>
+    </w:lvl>
+    <w:lvl w:ilvl="3" w:tplc="0C0A0001" w:tentative="1">
+      <w:start w:val="1"/>
+      <w:numFmt w:val="bullet"/>
+      <w:lvlText w:val=""/>
+      <w:lvlJc w:val="left"/>
+      <w:pPr>
+        <w:ind w:left="2880" w:hanging="360"/>
+      </w:pPr>
+      <w:rPr>
+        <w:rFonts w:ascii="Symbol" w:hAnsi="Symbol" w:hint="default"/>
+      </w:rPr>
+    </w:lvl>
+    <w:lvl w:ilvl="4" w:tplc="0C0A0003" w:tentative="1">
+      <w:start w:val="1"/>
+      <w:numFmt w:val="bullet"/>
+      <w:lvlText w:val="o"/>
+      <w:lvlJc w:val="left"/>
+      <w:pPr>
+        <w:ind w:left="3600" w:hanging="360"/>
+      </w:pPr>
+      <w:rPr>
+        <w:rFonts w:ascii="Courier New" w:hAnsi="Courier New" w:cs="Courier New" w:hint="default"/>
+      </w:rPr>
+    </w:lvl>
+    <w:lvl w:ilvl="5" w:tplc="0C0A0005" w:tentative="1">
+      <w:start w:val="1"/>
+      <w:numFmt w:val="bullet"/>
+      <w:lvlText w:val=""/>
+      <w:lvlJc w:val="left"/>
+      <w:pPr>
+        <w:ind w:left="4320" w:hanging="360"/>
+      </w:pPr>
+      <w:rPr>
+        <w:rFonts w:ascii="Wingdings" w:hAnsi="Wingdings" w:hint="default"/>
+      </w:rPr>
+    </w:lvl>
+    <w:lvl w:ilvl="6" w:tplc="0C0A0001" w:tentative="1">
+      <w:start w:val="1"/>
+      <w:numFmt w:val="bullet"/>
+      <w:lvlText w:val=""/>
+      <w:lvlJc w:val="left"/>
+      <w:pPr>
+        <w:ind w:left="5040" w:hanging="360"/>
+      </w:pPr>
+      <w:rPr>
+        <w:rFonts w:ascii="Symbol" w:hAnsi="Symbol" w:hint="default"/>
+      </w:rPr>
+    </w:lvl>
+    <w:lvl w:ilvl="7" w:tplc="0C0A0003" w:tentative="1">
+      <w:start w:val="1"/>
+      <w:numFmt w:val="bullet"/>
+      <w:lvlText w:val="o"/>
+      <w:lvlJc w:val="left"/>
+      <w:pPr>
+        <w:ind w:left="5760" w:hanging="360"/>
+      </w:pPr>
+      <w:rPr>
+        <w:rFonts w:ascii="Courier New" w:hAnsi="Courier New" w:cs="Courier New" w:hint="default"/>
+      </w:rPr>
+    </w:lvl>
+    <w:lvl w:ilvl="8" w:tplc="0C0A0005" w:tentative="1">
+      <w:start w:val="1"/>
+      <w:numFmt w:val="bullet"/>
+      <w:lvlText w:val=""/>
+      <w:lvlJc w:val="left"/>
+      <w:pPr>
+        <w:ind w:left="6480" w:hanging="360"/>
+      </w:pPr>
+      <w:rPr>
+        <w:rFonts w:ascii="Wingdings" w:hAnsi="Wingdings" w:hint="default"/>
+      </w:rPr>
+    </w:lvl>
+  </w:abstractNum>
+  <w:abstractNum w:abstractNumId="10" w15:restartNumberingAfterBreak="0">
+    <w:nsid w:val="769A48FF"/>
+    <w:multiLevelType w:val="multilevel"/>
+    <w:tmpl w:val="B284F9E6"/>
+    <w:lvl w:ilvl="0">
+      <w:start w:val="1"/>
+      <w:numFmt w:val="decimal"/>
+      <w:lvlText w:val="%1."/>
+      <w:lvlJc w:val="left"/>
+      <w:pPr>
+        <w:ind w:left="283" w:hanging="283"/>
+      </w:pPr>
+    </w:lvl>
+    <w:lvl w:ilvl="1">
+      <w:numFmt w:val="bullet"/>
+      <w:lvlText w:val="•"/>
+      <w:lvlJc w:val="left"/>
+      <w:pPr>
+        <w:ind w:left="992" w:hanging="283"/>
+      </w:pPr>
+      <w:rPr>
+        <w:rFonts w:ascii="OpenSymbol" w:eastAsia="OpenSymbol" w:hAnsi="OpenSymbol" w:cs="OpenSymbol"/>
+      </w:rPr>
+    </w:lvl>
+    <w:lvl w:ilvl="2">
+      <w:numFmt w:val="bullet"/>
+      <w:lvlText w:val="•"/>
+      <w:lvlJc w:val="left"/>
+      <w:pPr>
+        <w:ind w:left="1701" w:hanging="283"/>
+      </w:pPr>
+      <w:rPr>
+        <w:rFonts w:ascii="OpenSymbol" w:eastAsia="OpenSymbol" w:hAnsi="OpenSymbol" w:cs="OpenSymbol"/>
+      </w:rPr>
+    </w:lvl>
+    <w:lvl w:ilvl="3">
+      <w:numFmt w:val="bullet"/>
+      <w:lvlText w:val="•"/>
+      <w:lvlJc w:val="left"/>
+      <w:pPr>
+        <w:ind w:left="2410" w:hanging="283"/>
+      </w:pPr>
+      <w:rPr>
+        <w:rFonts w:ascii="OpenSymbol" w:eastAsia="OpenSymbol" w:hAnsi="OpenSymbol" w:cs="OpenSymbol"/>
+      </w:rPr>
+    </w:lvl>
+    <w:lvl w:ilvl="4">
+      <w:numFmt w:val="bullet"/>
+      <w:lvlText w:val="•"/>
+      <w:lvlJc w:val="left"/>
+      <w:pPr>
+        <w:ind w:left="3119" w:hanging="283"/>
+      </w:pPr>
+      <w:rPr>
+        <w:rFonts w:ascii="OpenSymbol" w:eastAsia="OpenSymbol" w:hAnsi="OpenSymbol" w:cs="OpenSymbol"/>
+      </w:rPr>
+    </w:lvl>
+    <w:lvl w:ilvl="5">
+      <w:numFmt w:val="bullet"/>
+      <w:lvlText w:val="•"/>
+      <w:lvlJc w:val="left"/>
+      <w:pPr>
+        <w:ind w:left="3828" w:hanging="283"/>
+      </w:pPr>
+      <w:rPr>
+        <w:rFonts w:ascii="OpenSymbol" w:eastAsia="OpenSymbol" w:hAnsi="OpenSymbol" w:cs="OpenSymbol"/>
+      </w:rPr>
+    </w:lvl>
+    <w:lvl w:ilvl="6">
+      <w:numFmt w:val="bullet"/>
+      <w:lvlText w:val="•"/>
+      <w:lvlJc w:val="left"/>
+      <w:pPr>
+        <w:ind w:left="4537" w:hanging="283"/>
+      </w:pPr>
+      <w:rPr>
+        <w:rFonts w:ascii="OpenSymbol" w:eastAsia="OpenSymbol" w:hAnsi="OpenSymbol" w:cs="OpenSymbol"/>
+      </w:rPr>
+    </w:lvl>
+    <w:lvl w:ilvl="7">
+      <w:numFmt w:val="bullet"/>
+      <w:lvlText w:val="•"/>
+      <w:lvlJc w:val="left"/>
+      <w:pPr>
+        <w:ind w:left="5246" w:hanging="283"/>
+      </w:pPr>
+      <w:rPr>
+        <w:rFonts w:ascii="OpenSymbol" w:eastAsia="OpenSymbol" w:hAnsi="OpenSymbol" w:cs="OpenSymbol"/>
+      </w:rPr>
+    </w:lvl>
+    <w:lvl w:ilvl="8">
+      <w:numFmt w:val="bullet"/>
+      <w:lvlText w:val="•"/>
+      <w:lvlJc w:val="left"/>
+      <w:pPr>
+        <w:ind w:left="5955" w:hanging="283"/>
+      </w:pPr>
+      <w:rPr>
+        <w:rFonts w:ascii="OpenSymbol" w:eastAsia="OpenSymbol" w:hAnsi="OpenSymbol" w:cs="OpenSymbol"/>
+      </w:rPr>
+    </w:lvl>
+  </w:abstractNum>
   <w:num w:numId="1" w16cid:durableId="1808430329">
+    <w:abstractNumId w:val="3"/>
+  </w:num>
+  <w:num w:numId="2" w16cid:durableId="525365372">
+    <w:abstractNumId w:val="8"/>
+  </w:num>
+  <w:num w:numId="3" w16cid:durableId="1664620931">
+    <w:abstractNumId w:val="5"/>
+  </w:num>
+  <w:num w:numId="4" w16cid:durableId="758406701">
+    <w:abstractNumId w:val="10"/>
+    <w:lvlOverride w:ilvl="0">
+      <w:startOverride w:val="1"/>
+    </w:lvlOverride>
+    <w:lvlOverride w:ilvl="1"/>
+    <w:lvlOverride w:ilvl="2"/>
+    <w:lvlOverride w:ilvl="3"/>
+    <w:lvlOverride w:ilvl="4"/>
+    <w:lvlOverride w:ilvl="5"/>
+    <w:lvlOverride w:ilvl="6"/>
+    <w:lvlOverride w:ilvl="7"/>
+    <w:lvlOverride w:ilvl="8"/>
+  </w:num>
+  <w:num w:numId="5" w16cid:durableId="1343505807">
+    <w:abstractNumId w:val="6"/>
+  </w:num>
+  <w:num w:numId="6" w16cid:durableId="1064061498">
+    <w:abstractNumId w:val="7"/>
+  </w:num>
+  <w:num w:numId="7" w16cid:durableId="914556358">
+    <w:abstractNumId w:val="1"/>
+  </w:num>
+  <w:num w:numId="8" w16cid:durableId="1938826045">
+    <w:abstractNumId w:val="4"/>
+  </w:num>
+  <w:num w:numId="9" w16cid:durableId="236747927">
     <w:abstractNumId w:val="0"/>
   </w:num>
-  <w:num w:numId="2" w16cid:durableId="525365372">
-    <w:abstractNumId w:val="1"/>
+  <w:num w:numId="10" w16cid:durableId="629289006">
+    <w:abstractNumId w:val="2"/>
+  </w:num>
+  <w:num w:numId="11" w16cid:durableId="785658104">
+    <w:abstractNumId w:val="9"/>
   </w:num>
 </w:numbering>
 </file>
@@ -3513,6 +6404,17 @@
       <w:sz w:val="22"/>
     </w:rPr>
   </w:style>
+  <w:style w:type="paragraph" w:styleId="Prrafodelista">
+    <w:name w:val="List Paragraph"/>
+    <w:basedOn w:val="Normal"/>
+    <w:uiPriority w:val="34"/>
+    <w:qFormat/>
+    <w:rsid w:val="004B3DDE"/>
+    <w:pPr>
+      <w:ind w:left="720"/>
+      <w:contextualSpacing/>
+    </w:pPr>
+  </w:style>
 </w:styles>
 </file>
 
@@ -3837,28 +6739,28 @@
 </file>
 
 <file path=customXml/item1.xml><?xml version="1.0" encoding="utf-8"?>
-<b:Sources xmlns:b="http://schemas.openxmlformats.org/officeDocument/2006/bibliography" xmlns="http://schemas.openxmlformats.org/officeDocument/2006/bibliography" SelectedStyle="\APASixthEditionOfficeOnline.xsl" StyleName="APA" Version="6"/>
-</file>
-
-<file path=customXml/item2.xml><?xml version="1.0" encoding="utf-8"?>
 <go:gDocsCustomXmlDataStorage xmlns:go="http://customooxmlschemas.google.com/" xmlns:r="http://schemas.openxmlformats.org/officeDocument/2006/relationships" uri="GoogleDocsCustomDataVersion2">
   <go:docsCustomData xmlns:go="http://customooxmlschemas.google.com/" roundtripDataSignature="AMtx7mjtTp76A7XcfsA3e8mJS6BPWqp4rA==">CgMxLjAyCGguZ2pkZ3hzMgloLjMwajB6bGwyCWguMWZvYjl0ZTIJaC4zem55c2g3MgloLjJldDkycDAyCGgudHlqY3d0MgloLjNkeTZ2a20yCWguMXQzaDVzZjIJaC40ZDM0b2c4MgloLjJzOGV5bzEyCWguMTdkcDh2dTIJaC4zcmRjcmpuMgloLjI2aW4xcmcyCGgubG54Yno5MgloLjM1bmt1bjIyCWguMWtzdjR1djIJaC40NHNpbmlvMgloLjJqeHN4cWgyCGguejMzN3lhMgloLjNqMnFxbTM4AHIhMW5lMFliWWRuQ3k4bG9vUWRRN2RCbXdrWjQzTkRTd0JD</go:docsCustomData>
 </go:gDocsCustomXmlDataStorage>
 </file>
 
-<file path=customXml/itemProps1.xml><?xml version="1.0" encoding="utf-8"?>
-<ds:datastoreItem xmlns:ds="http://schemas.openxmlformats.org/officeDocument/2006/customXml" ds:itemID="{E66D56AF-1747-4E2C-9179-14FD0640A7CF}">
-  <ds:schemaRefs>
-    <ds:schemaRef ds:uri="http://schemas.openxmlformats.org/officeDocument/2006/bibliography"/>
-  </ds:schemaRefs>
-</ds:datastoreItem>
+<file path=customXml/item2.xml><?xml version="1.0" encoding="utf-8"?>
+<b:Sources xmlns:b="http://schemas.openxmlformats.org/officeDocument/2006/bibliography" xmlns="http://schemas.openxmlformats.org/officeDocument/2006/bibliography" SelectedStyle="\APASixthEditionOfficeOnline.xsl" StyleName="APA" Version="6"/>
 </file>
 
-<file path=customXml/itemProps2.xml><?xml version="1.0" encoding="utf-8"?>
+<file path=customXml/itemProps1.xml><?xml version="1.0" encoding="utf-8"?>
 <ds:datastoreItem xmlns:ds="http://schemas.openxmlformats.org/officeDocument/2006/customXml" ds:itemID="{11111111-1234-1234-1234-123412341234}">
   <ds:schemaRefs>
     <ds:schemaRef ds:uri="http://customooxmlschemas.google.com/"/>
     <ds:schemaRef ds:uri="http://schemas.openxmlformats.org/officeDocument/2006/relationships"/>
   </ds:schemaRefs>
 </ds:datastoreItem>
+</file>
+
+<file path=customXml/itemProps2.xml><?xml version="1.0" encoding="utf-8"?>
+<ds:datastoreItem xmlns:ds="http://schemas.openxmlformats.org/officeDocument/2006/customXml" ds:itemID="{E66D56AF-1747-4E2C-9179-14FD0640A7CF}">
+  <ds:schemaRefs>
+    <ds:schemaRef ds:uri="http://schemas.openxmlformats.org/officeDocument/2006/bibliography"/>
+  </ds:schemaRefs>
+</ds:datastoreItem>
 </file>
</xml_diff>